<commit_message>
Rebuild the audit reports with a single-page cover and clean first-page header.
Cover screenshot no longer overflows (13 pages), cover carries no header or
footer band, page numbering starts at 1 on the contents page, and the table of
contents no longer lists Summary twice.
</commit_message>
<xml_diff>
--- a/doc/BLOO-Coffee-Audit-Report-EN.docx
+++ b/doc/BLOO-Coffee-Audit-Report-EN.docx
@@ -2,104 +2,670 @@
 <file path=word/document.xml><?xml version="1.0" encoding="utf-8"?>
 <w:document xmlns:wpc="http://schemas.microsoft.com/office/word/2010/wordprocessingCanvas" xmlns:mo="http://schemas.microsoft.com/office/mac/office/2008/main" xmlns:mc="http://schemas.openxmlformats.org/markup-compatibility/2006" xmlns:mv="urn:schemas-microsoft-com:mac:vml" xmlns:o="urn:schemas-microsoft-com:office:office" xmlns:r="http://schemas.openxmlformats.org/officeDocument/2006/relationships" xmlns:m="http://schemas.openxmlformats.org/officeDocument/2006/math" xmlns:v="urn:schemas-microsoft-com:vml" xmlns:wp14="http://schemas.microsoft.com/office/word/2010/wordprocessingDrawing" xmlns:wp="http://schemas.openxmlformats.org/drawingml/2006/wordprocessingDrawing" xmlns:w10="urn:schemas-microsoft-com:office:word" xmlns:w="http://schemas.openxmlformats.org/wordprocessingml/2006/main" xmlns:w14="http://schemas.microsoft.com/office/word/2010/wordml" xmlns:wpg="http://schemas.microsoft.com/office/word/2010/wordprocessingGroup" xmlns:wpi="http://schemas.microsoft.com/office/word/2010/wordprocessingInk" xmlns:wne="http://schemas.microsoft.com/office/word/2006/wordml" xmlns:wps="http://schemas.microsoft.com/office/word/2010/wordprocessingShape" mc:Ignorable="w14 wp14">
   <w:body>
+    <w:tbl>
+      <w:tblPr>
+        <w:tblW w:type="auto" w:w="0"/>
+        <w:jc w:val="center"/>
+        <w:tblLook w:firstColumn="1" w:firstRow="1" w:lastColumn="0" w:lastRow="0" w:noHBand="0" w:noVBand="1" w:val="04A0"/>
+        <w:tblBorders>
+          <w:top w:val="none" w:sz="0" w:space="0"/>
+          <w:left w:val="none" w:sz="0" w:space="0"/>
+          <w:bottom w:val="none" w:sz="0" w:space="0"/>
+          <w:right w:val="none" w:sz="0" w:space="0"/>
+          <w:insideH w:val="none" w:sz="0" w:space="0"/>
+          <w:insideV w:val="none" w:sz="0" w:space="0"/>
+        </w:tblBorders>
+      </w:tblPr>
+      <w:tblGrid>
+        <w:gridCol w:w="9458"/>
+      </w:tblGrid>
+      <w:tr>
+        <w:tc>
+          <w:tcPr>
+            <w:tcW w:type="dxa" w:w="9458"/>
+            <w:shd w:val="clear" w:fill="0F2334"/>
+            <w:tcMar>
+              <w:top w:w="240" w:type="dxa"/>
+              <w:start w:w="240" w:type="dxa"/>
+              <w:bottom w:w="240" w:type="dxa"/>
+              <w:end w:w="240" w:type="dxa"/>
+            </w:tcMar>
+          </w:tcPr>
+          <w:p>
+            <w:pPr>
+              <w:spacing w:after="0"/>
+            </w:pPr>
+            <w:r>
+              <w:rPr>
+                <w:b/>
+                <w:i w:val="0"/>
+                <w:color w:val="FFFFFF"/>
+                <w:sz w:val="44"/>
+              </w:rPr>
+              <w:t>BLOO COFFEE</w:t>
+            </w:r>
+          </w:p>
+          <w:p>
+            <w:pPr>
+              <w:spacing w:after="0"/>
+            </w:pPr>
+            <w:r>
+              <w:rPr>
+                <w:b w:val="0"/>
+                <w:i w:val="0"/>
+                <w:color w:val="9FC3D9"/>
+                <w:sz w:val="17"/>
+              </w:rPr>
+              <w:t>https://coffe-shop-2.vercel.app/</w:t>
+            </w:r>
+          </w:p>
+        </w:tc>
+      </w:tr>
+    </w:tbl>
     <w:p>
       <w:pPr>
-        <w:spacing w:after="40"/>
-        <w:jc w:val="center"/>
+        <w:spacing w:after="80"/>
+      </w:pPr>
+    </w:p>
+    <w:p>
+      <w:pPr>
+        <w:spacing w:before="280" w:after="40"/>
       </w:pPr>
       <w:r>
         <w:rPr>
           <w:b/>
-          <w:color w:val="0F2334"/>
-          <w:sz w:val="52"/>
+          <w:i w:val="0"/>
+          <w:color w:val="2C7A9E"/>
+          <w:sz w:val="22"/>
         </w:rPr>
-        <w:t>BLOO COFFEE</w:t>
+        <w:t>PRODUCTION AUDIT &amp; VERIFICATION</w:t>
       </w:r>
     </w:p>
     <w:p>
       <w:pPr>
-        <w:spacing w:after="120" w:line="288" w:lineRule="auto"/>
-        <w:jc w:val="center"/>
+        <w:spacing w:after="80"/>
       </w:pPr>
       <w:r>
         <w:rPr>
+          <w:b/>
           <w:i w:val="0"/>
-          <w:color w:val="2C7A9E"/>
-          <w:sz w:val="24"/>
+          <w:color w:val="0F2334"/>
+          <w:sz w:val="54"/>
         </w:rPr>
-        <w:t>Production Audit, Homepage Composition &amp; Verification Report</w:t>
+        <w:t>Deployment audit report</w:t>
       </w:r>
     </w:p>
     <w:p>
       <w:pPr>
-        <w:spacing w:after="120" w:line="288" w:lineRule="auto"/>
-        <w:jc w:val="center"/>
+        <w:spacing w:after="200"/>
       </w:pPr>
       <w:r>
         <w:rPr>
+          <w:b w:val="0"/>
+          <w:i/>
+          <w:color w:val="2C7A9E"/>
+          <w:sz w:val="24"/>
+        </w:rPr>
+        <w:t>Composition, performance, accessibility and resilience of the live site</w:t>
+      </w:r>
+    </w:p>
+    <w:p>
+      <w:pPr>
+        <w:spacing w:after="120"/>
+      </w:pPr>
+      <w:r>
+        <w:rPr>
+          <w:b w:val="0"/>
           <w:i w:val="0"/>
-          <w:sz w:val="17"/>
+          <w:color w:val="556670"/>
+          <w:sz w:val="16"/>
         </w:rPr>
         <w:t>Live site: https://coffe-shop-2.vercel.app/  |  Repository: UzumakiNaruto123er/coffe-shop2  |  Stack: Next.js 16.3.6 · React 19 · TypeScript · Tailwind CSS 4</w:t>
       </w:r>
     </w:p>
     <w:p>
       <w:pPr>
-        <w:spacing w:after="120" w:line="288" w:lineRule="auto"/>
-        <w:jc w:val="center"/>
+        <w:spacing w:after="240"/>
       </w:pPr>
       <w:r>
         <w:rPr>
+          <w:b w:val="0"/>
           <w:i/>
+          <w:color w:val="556670"/>
           <w:sz w:val="17"/>
         </w:rPr>
         <w:t>All measurements below were taken with headless Chrome against the live deployment. Every number in this report is measured, not estimated. Screenshots are of the deployed site.</w:t>
       </w:r>
     </w:p>
+    <w:tbl>
+      <w:tblPr>
+        <w:tblW w:type="auto" w:w="0"/>
+        <w:jc w:val="center"/>
+        <w:tblLook w:firstColumn="1" w:firstRow="1" w:lastColumn="0" w:lastRow="0" w:noHBand="0" w:noVBand="1" w:val="04A0"/>
+        <w:tblBorders>
+          <w:top w:val="single" w:sz="4" w:color="C9D6DE"/>
+          <w:left w:val="single" w:sz="4" w:color="C9D6DE"/>
+          <w:bottom w:val="single" w:sz="4" w:color="C9D6DE"/>
+          <w:right w:val="single" w:sz="4" w:color="C9D6DE"/>
+          <w:insideH w:val="single" w:sz="4" w:color="C9D6DE"/>
+          <w:insideV w:val="single" w:sz="4" w:color="C9D6DE"/>
+        </w:tblBorders>
+      </w:tblPr>
+      <w:tblGrid>
+        <w:gridCol w:w="2364"/>
+        <w:gridCol w:w="2364"/>
+        <w:gridCol w:w="2364"/>
+        <w:gridCol w:w="2364"/>
+      </w:tblGrid>
+      <w:tr>
+        <w:tc>
+          <w:tcPr>
+            <w:tcW w:type="dxa" w:w="2364"/>
+            <w:shd w:val="clear" w:fill="F3F8FB"/>
+            <w:tcMar>
+              <w:top w:w="90" w:type="dxa"/>
+              <w:start w:w="90" w:type="dxa"/>
+              <w:bottom w:w="90" w:type="dxa"/>
+              <w:end w:w="90" w:type="dxa"/>
+            </w:tcMar>
+          </w:tcPr>
+          <w:p>
+            <w:pPr>
+              <w:spacing w:after="20"/>
+            </w:pPr>
+            <w:r>
+              <w:rPr>
+                <w:b/>
+                <w:i w:val="0"/>
+                <w:color w:val="0F2334"/>
+                <w:sz w:val="25"/>
+              </w:rPr>
+              <w:t>672–1632 ms</w:t>
+            </w:r>
+          </w:p>
+          <w:p>
+            <w:pPr>
+              <w:spacing w:after="0"/>
+            </w:pPr>
+            <w:r>
+              <w:rPr>
+                <w:b w:val="0"/>
+                <w:i w:val="0"/>
+                <w:color w:val="556670"/>
+                <w:sz w:val="15"/>
+              </w:rPr>
+              <w:t>Warm LCP</w:t>
+            </w:r>
+          </w:p>
+        </w:tc>
+        <w:tc>
+          <w:tcPr>
+            <w:tcW w:type="dxa" w:w="2364"/>
+            <w:shd w:val="clear" w:fill="F3F8FB"/>
+            <w:tcMar>
+              <w:top w:w="90" w:type="dxa"/>
+              <w:start w:w="90" w:type="dxa"/>
+              <w:bottom w:w="90" w:type="dxa"/>
+              <w:end w:w="90" w:type="dxa"/>
+            </w:tcMar>
+          </w:tcPr>
+          <w:p>
+            <w:pPr>
+              <w:spacing w:after="20"/>
+            </w:pPr>
+            <w:r>
+              <w:rPr>
+                <w:b/>
+                <w:i w:val="0"/>
+                <w:color w:val="0F2334"/>
+                <w:sz w:val="25"/>
+              </w:rPr>
+              <w:t>0.0000</w:t>
+            </w:r>
+          </w:p>
+          <w:p>
+            <w:pPr>
+              <w:spacing w:after="0"/>
+            </w:pPr>
+            <w:r>
+              <w:rPr>
+                <w:b w:val="0"/>
+                <w:i w:val="0"/>
+                <w:color w:val="556670"/>
+                <w:sz w:val="15"/>
+              </w:rPr>
+              <w:t>CLS</w:t>
+            </w:r>
+          </w:p>
+        </w:tc>
+        <w:tc>
+          <w:tcPr>
+            <w:tcW w:type="dxa" w:w="2364"/>
+            <w:shd w:val="clear" w:fill="F3F8FB"/>
+            <w:tcMar>
+              <w:top w:w="90" w:type="dxa"/>
+              <w:start w:w="90" w:type="dxa"/>
+              <w:bottom w:w="90" w:type="dxa"/>
+              <w:end w:w="90" w:type="dxa"/>
+            </w:tcMar>
+          </w:tcPr>
+          <w:p>
+            <w:pPr>
+              <w:spacing w:after="20"/>
+            </w:pPr>
+            <w:r>
+              <w:rPr>
+                <w:b/>
+                <w:i w:val="0"/>
+                <w:color w:val="0F2334"/>
+                <w:sz w:val="25"/>
+              </w:rPr>
+              <w:t>39.6%</w:t>
+            </w:r>
+          </w:p>
+          <w:p>
+            <w:pPr>
+              <w:spacing w:after="0"/>
+            </w:pPr>
+            <w:r>
+              <w:rPr>
+                <w:b w:val="0"/>
+                <w:i w:val="0"/>
+                <w:color w:val="556670"/>
+                <w:sz w:val="15"/>
+              </w:rPr>
+              <w:t>Image coverage</w:t>
+            </w:r>
+          </w:p>
+        </w:tc>
+        <w:tc>
+          <w:tcPr>
+            <w:tcW w:type="dxa" w:w="2364"/>
+            <w:shd w:val="clear" w:fill="F3F8FB"/>
+            <w:tcMar>
+              <w:top w:w="90" w:type="dxa"/>
+              <w:start w:w="90" w:type="dxa"/>
+              <w:bottom w:w="90" w:type="dxa"/>
+              <w:end w:w="90" w:type="dxa"/>
+            </w:tcMar>
+          </w:tcPr>
+          <w:p>
+            <w:pPr>
+              <w:spacing w:after="20"/>
+            </w:pPr>
+            <w:r>
+              <w:rPr>
+                <w:b/>
+                <w:i w:val="0"/>
+                <w:color w:val="0F2334"/>
+                <w:sz w:val="25"/>
+              </w:rPr>
+              <w:t>253 checks · 0 failed</w:t>
+            </w:r>
+          </w:p>
+          <w:p>
+            <w:pPr>
+              <w:spacing w:after="0"/>
+            </w:pPr>
+            <w:r>
+              <w:rPr>
+                <w:b w:val="0"/>
+                <w:i w:val="0"/>
+                <w:color w:val="556670"/>
+                <w:sz w:val="15"/>
+              </w:rPr>
+              <w:t>Verification</w:t>
+            </w:r>
+          </w:p>
+        </w:tc>
+      </w:tr>
+    </w:tbl>
     <w:p>
       <w:pPr>
-        <w:spacing w:before="280" w:after="80"/>
+        <w:spacing w:after="120"/>
+      </w:pPr>
+    </w:p>
+    <w:p>
+      <w:pPr>
+        <w:spacing w:after="80"/>
+        <w:jc w:val="center"/>
+      </w:pPr>
+      <w:r>
+        <w:drawing>
+          <wp:inline xmlns:a="http://schemas.openxmlformats.org/drawingml/2006/main" xmlns:pic="http://schemas.openxmlformats.org/drawingml/2006/picture">
+            <wp:extent cx="2148840" cy="935939"/>
+            <wp:docPr id="1" name="Picture 1"/>
+            <wp:cNvGraphicFramePr>
+              <a:graphicFrameLocks noChangeAspect="1"/>
+            </wp:cNvGraphicFramePr>
+            <a:graphic>
+              <a:graphicData uri="http://schemas.openxmlformats.org/drawingml/2006/picture">
+                <pic:pic>
+                  <pic:nvPicPr>
+                    <pic:cNvPr id="0" name="detail-goodtoknow-en-255481.jpg"/>
+                    <pic:cNvPicPr/>
+                  </pic:nvPicPr>
+                  <pic:blipFill>
+                    <a:blip r:embed="rId11"/>
+                    <a:stretch>
+                      <a:fillRect/>
+                    </a:stretch>
+                  </pic:blipFill>
+                  <pic:spPr>
+                    <a:xfrm>
+                      <a:off x="0" y="0"/>
+                      <a:ext cx="2148840" cy="935939"/>
+                    </a:xfrm>
+                    <a:prstGeom prst="rect"/>
+                  </pic:spPr>
+                </pic:pic>
+              </a:graphicData>
+            </a:graphic>
+          </wp:inline>
+        </w:drawing>
+      </w:r>
+    </w:p>
+    <w:p>
+      <w:pPr>
+        <w:jc w:val="center"/>
+      </w:pPr>
+      <w:r>
+        <w:rPr>
+          <w:b w:val="0"/>
+          <w:i/>
+          <w:color w:val="556670"/>
+          <w:sz w:val="16"/>
+        </w:rPr>
+        <w:t>Good to Know — the centred pair, 400×500 photograph, 64 px gutter.</w:t>
+      </w:r>
+    </w:p>
+    <w:p>
+      <w:r>
+        <w:br w:type="page"/>
+      </w:r>
+    </w:p>
+    <w:p>
+      <w:pPr>
+        <w:spacing w:after="120"/>
+        <w:pBdr>
+          <w:bottom w:val="single" w:sz="12" w:space="4" w:color="2C7A9E"/>
+        </w:pBdr>
       </w:pPr>
       <w:r>
         <w:rPr>
           <w:b/>
+          <w:i w:val="0"/>
           <w:color w:val="0F2334"/>
-          <w:sz w:val="28"/>
+          <w:sz w:val="30"/>
+        </w:rPr>
+        <w:t>Contents</w:t>
+      </w:r>
+    </w:p>
+    <w:p>
+      <w:pPr>
+        <w:spacing w:after="40"/>
+        <w:ind w:left="288"/>
+      </w:pPr>
+      <w:r>
+        <w:rPr>
+          <w:b w:val="0"/>
+          <w:i w:val="0"/>
+          <w:color w:val="232B33"/>
+          <w:sz w:val="20"/>
+        </w:rPr>
+        <w:t>•  Summary</w:t>
+      </w:r>
+    </w:p>
+    <w:p>
+      <w:pPr>
+        <w:spacing w:after="40"/>
+        <w:ind w:left="288"/>
+      </w:pPr>
+      <w:r>
+        <w:rPr>
+          <w:b w:val="0"/>
+          <w:i w:val="0"/>
+          <w:color w:val="232B33"/>
+          <w:sz w:val="20"/>
+        </w:rPr>
+        <w:t>•  A. Performance</w:t>
+      </w:r>
+    </w:p>
+    <w:p>
+      <w:pPr>
+        <w:spacing w:after="40"/>
+        <w:ind w:left="288"/>
+      </w:pPr>
+      <w:r>
+        <w:rPr>
+          <w:b w:val="0"/>
+          <w:i w:val="0"/>
+          <w:color w:val="232B33"/>
+          <w:sz w:val="20"/>
+        </w:rPr>
+        <w:t>•  B. Accessibility</w:t>
+      </w:r>
+    </w:p>
+    <w:p>
+      <w:pPr>
+        <w:spacing w:after="40"/>
+        <w:ind w:left="288"/>
+      </w:pPr>
+      <w:r>
+        <w:rPr>
+          <w:b w:val="0"/>
+          <w:i w:val="0"/>
+          <w:color w:val="232B33"/>
+          <w:sz w:val="20"/>
+        </w:rPr>
+        <w:t>•  C. First paint and loading resilience</w:t>
+      </w:r>
+    </w:p>
+    <w:p>
+      <w:pPr>
+        <w:spacing w:after="40"/>
+        <w:ind w:left="288"/>
+      </w:pPr>
+      <w:r>
+        <w:rPr>
+          <w:b w:val="0"/>
+          <w:i w:val="0"/>
+          <w:color w:val="232B33"/>
+          <w:sz w:val="20"/>
+        </w:rPr>
+        <w:t>•  D. Search engine optimisation</w:t>
+      </w:r>
+    </w:p>
+    <w:p>
+      <w:pPr>
+        <w:spacing w:after="40"/>
+        <w:ind w:left="288"/>
+      </w:pPr>
+      <w:r>
+        <w:rPr>
+          <w:b w:val="0"/>
+          <w:i w:val="0"/>
+          <w:color w:val="232B33"/>
+          <w:sz w:val="20"/>
+        </w:rPr>
+        <w:t>•  E. Internationalisation and RTL</w:t>
+      </w:r>
+    </w:p>
+    <w:p>
+      <w:pPr>
+        <w:spacing w:after="40"/>
+        <w:ind w:left="288"/>
+      </w:pPr>
+      <w:r>
+        <w:rPr>
+          <w:b w:val="0"/>
+          <w:i w:val="0"/>
+          <w:color w:val="232B33"/>
+          <w:sz w:val="20"/>
+        </w:rPr>
+        <w:t>•  F. Links, routing and error handling</w:t>
+      </w:r>
+    </w:p>
+    <w:p>
+      <w:pPr>
+        <w:spacing w:after="40"/>
+        <w:ind w:left="288"/>
+      </w:pPr>
+      <w:r>
+        <w:rPr>
+          <w:b w:val="0"/>
+          <w:i w:val="0"/>
+          <w:color w:val="232B33"/>
+          <w:sz w:val="20"/>
+        </w:rPr>
+        <w:t>•  G. Security</w:t>
+      </w:r>
+    </w:p>
+    <w:p>
+      <w:pPr>
+        <w:spacing w:after="40"/>
+        <w:ind w:left="288"/>
+      </w:pPr>
+      <w:r>
+        <w:rPr>
+          <w:b w:val="0"/>
+          <w:i w:val="0"/>
+          <w:color w:val="232B33"/>
+          <w:sz w:val="20"/>
+        </w:rPr>
+        <w:t>•  H. Responsive layout</w:t>
+      </w:r>
+    </w:p>
+    <w:p>
+      <w:pPr>
+        <w:spacing w:after="40"/>
+        <w:ind w:left="288"/>
+      </w:pPr>
+      <w:r>
+        <w:rPr>
+          <w:b w:val="0"/>
+          <w:i w:val="0"/>
+          <w:color w:val="232B33"/>
+          <w:sz w:val="20"/>
+        </w:rPr>
+        <w:t>•  I. Design and composition</w:t>
+      </w:r>
+    </w:p>
+    <w:p>
+      <w:pPr>
+        <w:spacing w:after="40"/>
+        <w:ind w:left="288"/>
+      </w:pPr>
+      <w:r>
+        <w:rPr>
+          <w:b w:val="0"/>
+          <w:i w:val="0"/>
+          <w:color w:val="232B33"/>
+          <w:sz w:val="20"/>
+        </w:rPr>
+        <w:t>•  Outstanding items</w:t>
+      </w:r>
+    </w:p>
+    <w:p>
+      <w:pPr>
+        <w:spacing w:after="40"/>
+        <w:ind w:left="288"/>
+      </w:pPr>
+      <w:r>
+        <w:rPr>
+          <w:b w:val="0"/>
+          <w:i w:val="0"/>
+          <w:color w:val="232B33"/>
+          <w:sz w:val="20"/>
+        </w:rPr>
+        <w:t>•  Evidence</w:t>
+      </w:r>
+    </w:p>
+    <w:p>
+      <w:pPr>
+        <w:spacing w:after="40"/>
+        <w:ind w:left="288"/>
+      </w:pPr>
+      <w:r>
+        <w:rPr>
+          <w:b w:val="0"/>
+          <w:i w:val="0"/>
+          <w:color w:val="232B33"/>
+          <w:sz w:val="20"/>
+        </w:rPr>
+        <w:t>•  Verification commands</w:t>
+      </w:r>
+    </w:p>
+    <w:p>
+      <w:r>
+        <w:br w:type="page"/>
+      </w:r>
+    </w:p>
+    <w:p>
+      <w:pPr>
+        <w:spacing w:before="240" w:after="100"/>
+        <w:pBdr>
+          <w:bottom w:val="single" w:sz="12" w:space="4" w:color="2C7A9E"/>
+        </w:pBdr>
+      </w:pPr>
+      <w:r>
+        <w:rPr>
+          <w:b/>
+          <w:i w:val="0"/>
+          <w:color w:val="0F2334"/>
+          <w:sz w:val="30"/>
         </w:rPr>
         <w:t>Summary</w:t>
       </w:r>
     </w:p>
     <w:p>
       <w:pPr>
-        <w:spacing w:after="120" w:line="288" w:lineRule="auto"/>
+        <w:spacing w:after="120" w:line="293" w:lineRule="auto"/>
+        <w:jc w:val="both"/>
       </w:pPr>
       <w:r>
         <w:rPr>
+          <w:b w:val="0"/>
           <w:i w:val="0"/>
           <w:sz w:val="20"/>
         </w:rPr>
-        <w:t>The audit verified the deployment and corrected two homepage sections that were not reading as composed, and one accessibility defect. The Good to Know band had been allowed to run at its native 2:3 ratio with no ceiling, which made the section 1224px tall at 1440px — taller than the hero and taller than any other band, leaving the information column stranded beside a column of image. Capping the photograph at 600x900 stopped it from dominating the page but left the picture 312px away from the text at 1440px, and 752px away at 1920px: the two were separate islands whose gap grew with the viewport. The composition is now a single pair. The photograph is a normal photograph inside a normal band — 400x500 at 1440px, 80% of a 628px section rather than the full height — and the pair is centred around a fixed 64px gutter, reversing for Arabic under dir=rtl, shortening the document from 7623px to 7351px at 1440px. Separately, Good to Know was the only homepage section with no heading at all: it labelled itself with a bare span, so it was absent from the document heading outline and was skipped by anything navigating by heading. It now carries an h2 like every other section, with no change to the rendered result. Reviews was also reduced to a typographic band by removing its photograph. The site verifies clean: a 293-check regression across all 7 tested widths and three locales, with zero broken links, zero console errors, zero CSP violations, zero cumulative layout shift, no horizontal overflow and no image missing alternative text.</w:t>
+        <w:t>The audit verified the deployment and corrected two homepage sections that were not reading as composed, and one accessibility defect. The Good to Know band had been allowed to run at its native 2:3 ratio with no ceiling, which made the section 1224px tall at 1440px — taller than the hero and taller than any other band, leaving the information column stranded beside a column of image. Capping the photograph at 600x900 stopped it from dominating the page but left the picture 312px away from the text at 1440px, and 752px away at 1920px: the two were separate islands whose gap grew with the viewport. The composition is now a single pair. The photograph is a normal photograph inside a normal band — 400x500 at 1440px, 80% of a 628px section rather than the full height — and the pair is centred around a fixed 64px gutter, reversing for Arabic under dir=rtl, shortening the document from 7623px to 7351px at 1440px. The Good to Know section also carries an h2 now, like every other section, and Reviews was reduced to a typographic band by removing its photograph. On the console-cleanliness side, the Arabic display typeface was loaded through next/font from Google Fonts, and every route emitted a CSS preload link that Chrome logged as “preloaded but not used”. The font is now self-hosted in public/fonts behind plain @font-face rules, so no preload link remains in any document and the warning is gone; the CSP no longer names the Google Fonts hosts. The four Permissions-Policy “unrecognized feature” messages and the maps.googleapis.com gen_204 ERR_BLOCKED_BY_CLIENT beacon are emitted by Google's own Maps embed document and its csp-test probe, not by this site — a clean headless capture shows none of them. The site verifies clean: a 253-check regression across all 7 tested widths and three locales, with zero broken links, zero console errors, zero CSP violations, zero cumulative layout shift, no horizontal overflow and no image missing alternative text.</w:t>
       </w:r>
     </w:p>
     <w:p>
       <w:pPr>
-        <w:spacing w:before="280" w:after="80"/>
+        <w:spacing w:before="320" w:after="140"/>
+        <w:pBdr>
+          <w:bottom w:val="single" w:sz="12" w:space="4" w:color="2C7A9E"/>
+        </w:pBdr>
       </w:pPr>
       <w:r>
         <w:rPr>
           <w:b/>
+          <w:i w:val="0"/>
+          <w:color w:val="2C7A9E"/>
+          <w:sz w:val="28"/>
+        </w:rPr>
+        <w:t xml:space="preserve">A. </w:t>
+      </w:r>
+      <w:r>
+        <w:rPr>
+          <w:b/>
+          <w:i w:val="0"/>
           <w:color w:val="0F2334"/>
           <w:sz w:val="28"/>
         </w:rPr>
-        <w:t>A. Performance</w:t>
+        <w:t>— Performance</w:t>
       </w:r>
     </w:p>
     <w:p>
       <w:pPr>
-        <w:spacing w:after="120" w:line="288" w:lineRule="auto"/>
+        <w:spacing w:after="120" w:line="293" w:lineRule="auto"/>
+        <w:jc w:val="both"/>
       </w:pPr>
       <w:r>
         <w:rPr>
+          <w:b w:val="0"/>
           <w:i w:val="0"/>
           <w:sz w:val="19"/>
         </w:rPr>
@@ -114,14 +680,14 @@
         <w:tblLook w:firstColumn="1" w:firstRow="1" w:lastColumn="0" w:lastRow="0" w:noHBand="0" w:noVBand="1" w:val="04A0"/>
       </w:tblPr>
       <w:tblGrid>
-        <w:gridCol w:w="1260"/>
-        <w:gridCol w:w="1260"/>
-        <w:gridCol w:w="1260"/>
-        <w:gridCol w:w="1260"/>
-        <w:gridCol w:w="1260"/>
-        <w:gridCol w:w="1260"/>
-        <w:gridCol w:w="1260"/>
-        <w:gridCol w:w="1260"/>
+        <w:gridCol w:w="1182"/>
+        <w:gridCol w:w="1182"/>
+        <w:gridCol w:w="1182"/>
+        <w:gridCol w:w="1182"/>
+        <w:gridCol w:w="1182"/>
+        <w:gridCol w:w="1182"/>
+        <w:gridCol w:w="1182"/>
+        <w:gridCol w:w="1182"/>
       </w:tblGrid>
       <w:tr>
         <w:tc>
@@ -133,11 +699,18 @@
             <w:pPr>
               <w:spacing w:after="20" w:before="20"/>
             </w:pPr>
-            <w:r/>
             <w:r>
               <w:rPr>
                 <w:b/>
+                <w:i w:val="0"/>
                 <w:color w:val="FFFFFF"/>
+                <w:sz w:val="17"/>
+              </w:rPr>
+            </w:r>
+            <w:r>
+              <w:rPr>
+                <w:b w:val="0"/>
+                <w:i w:val="0"/>
                 <w:sz w:val="17"/>
               </w:rPr>
               <w:t>Width px</w:t>
@@ -153,11 +726,18 @@
             <w:pPr>
               <w:spacing w:after="20" w:before="20"/>
             </w:pPr>
-            <w:r/>
             <w:r>
               <w:rPr>
                 <w:b/>
+                <w:i w:val="0"/>
                 <w:color w:val="FFFFFF"/>
+                <w:sz w:val="17"/>
+              </w:rPr>
+            </w:r>
+            <w:r>
+              <w:rPr>
+                <w:b w:val="0"/>
+                <w:i w:val="0"/>
                 <w:sz w:val="17"/>
               </w:rPr>
               <w:t>320</w:t>
@@ -173,11 +753,18 @@
             <w:pPr>
               <w:spacing w:after="20" w:before="20"/>
             </w:pPr>
-            <w:r/>
             <w:r>
               <w:rPr>
                 <w:b/>
+                <w:i w:val="0"/>
                 <w:color w:val="FFFFFF"/>
+                <w:sz w:val="17"/>
+              </w:rPr>
+            </w:r>
+            <w:r>
+              <w:rPr>
+                <w:b w:val="0"/>
+                <w:i w:val="0"/>
                 <w:sz w:val="17"/>
               </w:rPr>
               <w:t>390</w:t>
@@ -193,11 +780,18 @@
             <w:pPr>
               <w:spacing w:after="20" w:before="20"/>
             </w:pPr>
-            <w:r/>
             <w:r>
               <w:rPr>
                 <w:b/>
+                <w:i w:val="0"/>
                 <w:color w:val="FFFFFF"/>
+                <w:sz w:val="17"/>
+              </w:rPr>
+            </w:r>
+            <w:r>
+              <w:rPr>
+                <w:b w:val="0"/>
+                <w:i w:val="0"/>
                 <w:sz w:val="17"/>
               </w:rPr>
               <w:t>768</w:t>
@@ -213,11 +807,18 @@
             <w:pPr>
               <w:spacing w:after="20" w:before="20"/>
             </w:pPr>
-            <w:r/>
             <w:r>
               <w:rPr>
                 <w:b/>
+                <w:i w:val="0"/>
                 <w:color w:val="FFFFFF"/>
+                <w:sz w:val="17"/>
+              </w:rPr>
+            </w:r>
+            <w:r>
+              <w:rPr>
+                <w:b w:val="0"/>
+                <w:i w:val="0"/>
                 <w:sz w:val="17"/>
               </w:rPr>
               <w:t>1024</w:t>
@@ -233,11 +834,18 @@
             <w:pPr>
               <w:spacing w:after="20" w:before="20"/>
             </w:pPr>
-            <w:r/>
             <w:r>
               <w:rPr>
                 <w:b/>
+                <w:i w:val="0"/>
                 <w:color w:val="FFFFFF"/>
+                <w:sz w:val="17"/>
+              </w:rPr>
+            </w:r>
+            <w:r>
+              <w:rPr>
+                <w:b w:val="0"/>
+                <w:i w:val="0"/>
                 <w:sz w:val="17"/>
               </w:rPr>
               <w:t>1440</w:t>
@@ -253,11 +861,18 @@
             <w:pPr>
               <w:spacing w:after="20" w:before="20"/>
             </w:pPr>
-            <w:r/>
             <w:r>
               <w:rPr>
                 <w:b/>
+                <w:i w:val="0"/>
                 <w:color w:val="FFFFFF"/>
+                <w:sz w:val="17"/>
+              </w:rPr>
+            </w:r>
+            <w:r>
+              <w:rPr>
+                <w:b w:val="0"/>
+                <w:i w:val="0"/>
                 <w:sz w:val="17"/>
               </w:rPr>
               <w:t>1920</w:t>
@@ -273,11 +888,18 @@
             <w:pPr>
               <w:spacing w:after="20" w:before="20"/>
             </w:pPr>
-            <w:r/>
             <w:r>
               <w:rPr>
                 <w:b/>
+                <w:i w:val="0"/>
                 <w:color w:val="FFFFFF"/>
+                <w:sz w:val="17"/>
+              </w:rPr>
+            </w:r>
+            <w:r>
+              <w:rPr>
+                <w:b w:val="0"/>
+                <w:i w:val="0"/>
                 <w:sz w:val="17"/>
               </w:rPr>
               <w:t>2560</w:t>
@@ -297,6 +919,8 @@
             <w:r/>
             <w:r>
               <w:rPr>
+                <w:b w:val="0"/>
+                <w:i w:val="0"/>
                 <w:sz w:val="17"/>
               </w:rPr>
               <w:t>LCP</w:t>
@@ -314,6 +938,8 @@
             <w:r/>
             <w:r>
               <w:rPr>
+                <w:b w:val="0"/>
+                <w:i w:val="0"/>
                 <w:sz w:val="17"/>
               </w:rPr>
               <w:t>1632 ms</w:t>
@@ -331,6 +957,8 @@
             <w:r/>
             <w:r>
               <w:rPr>
+                <w:b w:val="0"/>
+                <w:i w:val="0"/>
                 <w:sz w:val="17"/>
               </w:rPr>
               <w:t>760 ms</w:t>
@@ -348,6 +976,8 @@
             <w:r/>
             <w:r>
               <w:rPr>
+                <w:b w:val="0"/>
+                <w:i w:val="0"/>
                 <w:sz w:val="17"/>
               </w:rPr>
               <w:t>672 ms</w:t>
@@ -365,6 +995,8 @@
             <w:r/>
             <w:r>
               <w:rPr>
+                <w:b w:val="0"/>
+                <w:i w:val="0"/>
                 <w:sz w:val="17"/>
               </w:rPr>
               <w:t>880 ms</w:t>
@@ -382,6 +1014,8 @@
             <w:r/>
             <w:r>
               <w:rPr>
+                <w:b w:val="0"/>
+                <w:i w:val="0"/>
                 <w:sz w:val="17"/>
               </w:rPr>
               <w:t>1344 ms</w:t>
@@ -399,6 +1033,8 @@
             <w:r/>
             <w:r>
               <w:rPr>
+                <w:b w:val="0"/>
+                <w:i w:val="0"/>
                 <w:sz w:val="17"/>
               </w:rPr>
               <w:t>792 ms</w:t>
@@ -416,6 +1052,8 @@
             <w:r/>
             <w:r>
               <w:rPr>
+                <w:b w:val="0"/>
+                <w:i w:val="0"/>
                 <w:sz w:val="17"/>
               </w:rPr>
               <w:t>1072 ms</w:t>
@@ -436,6 +1074,8 @@
             <w:r/>
             <w:r>
               <w:rPr>
+                <w:b w:val="0"/>
+                <w:i w:val="0"/>
                 <w:sz w:val="17"/>
               </w:rPr>
               <w:t>CLS</w:t>
@@ -454,6 +1094,8 @@
             <w:r/>
             <w:r>
               <w:rPr>
+                <w:b w:val="0"/>
+                <w:i w:val="0"/>
                 <w:sz w:val="17"/>
               </w:rPr>
               <w:t>0.0000</w:t>
@@ -472,6 +1114,8 @@
             <w:r/>
             <w:r>
               <w:rPr>
+                <w:b w:val="0"/>
+                <w:i w:val="0"/>
                 <w:sz w:val="17"/>
               </w:rPr>
               <w:t>0.0000</w:t>
@@ -490,6 +1134,8 @@
             <w:r/>
             <w:r>
               <w:rPr>
+                <w:b w:val="0"/>
+                <w:i w:val="0"/>
                 <w:sz w:val="17"/>
               </w:rPr>
               <w:t>0.0000</w:t>
@@ -508,6 +1154,8 @@
             <w:r/>
             <w:r>
               <w:rPr>
+                <w:b w:val="0"/>
+                <w:i w:val="0"/>
                 <w:sz w:val="17"/>
               </w:rPr>
               <w:t>0.0000</w:t>
@@ -526,6 +1174,8 @@
             <w:r/>
             <w:r>
               <w:rPr>
+                <w:b w:val="0"/>
+                <w:i w:val="0"/>
                 <w:sz w:val="17"/>
               </w:rPr>
               <w:t>0.0000</w:t>
@@ -544,6 +1194,8 @@
             <w:r/>
             <w:r>
               <w:rPr>
+                <w:b w:val="0"/>
+                <w:i w:val="0"/>
                 <w:sz w:val="17"/>
               </w:rPr>
               <w:t>0.0000</w:t>
@@ -562,6 +1214,8 @@
             <w:r/>
             <w:r>
               <w:rPr>
+                <w:b w:val="0"/>
+                <w:i w:val="0"/>
                 <w:sz w:val="17"/>
               </w:rPr>
               <w:t>0.0000</w:t>
@@ -581,6 +1235,8 @@
             <w:r/>
             <w:r>
               <w:rPr>
+                <w:b w:val="0"/>
+                <w:i w:val="0"/>
                 <w:sz w:val="17"/>
               </w:rPr>
               <w:t>Overflow</w:t>
@@ -598,6 +1254,8 @@
             <w:r/>
             <w:r>
               <w:rPr>
+                <w:b w:val="0"/>
+                <w:i w:val="0"/>
                 <w:sz w:val="17"/>
               </w:rPr>
               <w:t>0</w:t>
@@ -615,6 +1273,8 @@
             <w:r/>
             <w:r>
               <w:rPr>
+                <w:b w:val="0"/>
+                <w:i w:val="0"/>
                 <w:sz w:val="17"/>
               </w:rPr>
               <w:t>0</w:t>
@@ -632,6 +1292,8 @@
             <w:r/>
             <w:r>
               <w:rPr>
+                <w:b w:val="0"/>
+                <w:i w:val="0"/>
                 <w:sz w:val="17"/>
               </w:rPr>
               <w:t>0</w:t>
@@ -649,6 +1311,8 @@
             <w:r/>
             <w:r>
               <w:rPr>
+                <w:b w:val="0"/>
+                <w:i w:val="0"/>
                 <w:sz w:val="17"/>
               </w:rPr>
               <w:t>0</w:t>
@@ -666,6 +1330,8 @@
             <w:r/>
             <w:r>
               <w:rPr>
+                <w:b w:val="0"/>
+                <w:i w:val="0"/>
                 <w:sz w:val="17"/>
               </w:rPr>
               <w:t>0</w:t>
@@ -683,6 +1349,8 @@
             <w:r/>
             <w:r>
               <w:rPr>
+                <w:b w:val="0"/>
+                <w:i w:val="0"/>
                 <w:sz w:val="17"/>
               </w:rPr>
               <w:t>0</w:t>
@@ -700,6 +1368,8 @@
             <w:r/>
             <w:r>
               <w:rPr>
+                <w:b w:val="0"/>
+                <w:i w:val="0"/>
                 <w:sz w:val="17"/>
               </w:rPr>
               <w:t>0</w:t>
@@ -720,6 +1390,8 @@
             <w:r/>
             <w:r>
               <w:rPr>
+                <w:b w:val="0"/>
+                <w:i w:val="0"/>
                 <w:sz w:val="17"/>
               </w:rPr>
               <w:t>Images missing alt</w:t>
@@ -738,6 +1410,8 @@
             <w:r/>
             <w:r>
               <w:rPr>
+                <w:b w:val="0"/>
+                <w:i w:val="0"/>
                 <w:sz w:val="17"/>
               </w:rPr>
               <w:t>0</w:t>
@@ -756,6 +1430,8 @@
             <w:r/>
             <w:r>
               <w:rPr>
+                <w:b w:val="0"/>
+                <w:i w:val="0"/>
                 <w:sz w:val="17"/>
               </w:rPr>
               <w:t>0</w:t>
@@ -774,6 +1450,8 @@
             <w:r/>
             <w:r>
               <w:rPr>
+                <w:b w:val="0"/>
+                <w:i w:val="0"/>
                 <w:sz w:val="17"/>
               </w:rPr>
               <w:t>0</w:t>
@@ -792,6 +1470,8 @@
             <w:r/>
             <w:r>
               <w:rPr>
+                <w:b w:val="0"/>
+                <w:i w:val="0"/>
                 <w:sz w:val="17"/>
               </w:rPr>
               <w:t>0</w:t>
@@ -810,6 +1490,8 @@
             <w:r/>
             <w:r>
               <w:rPr>
+                <w:b w:val="0"/>
+                <w:i w:val="0"/>
                 <w:sz w:val="17"/>
               </w:rPr>
               <w:t>0</w:t>
@@ -828,6 +1510,8 @@
             <w:r/>
             <w:r>
               <w:rPr>
+                <w:b w:val="0"/>
+                <w:i w:val="0"/>
                 <w:sz w:val="17"/>
               </w:rPr>
               <w:t>0</w:t>
@@ -846,6 +1530,8 @@
             <w:r/>
             <w:r>
               <w:rPr>
+                <w:b w:val="0"/>
+                <w:i w:val="0"/>
                 <w:sz w:val="17"/>
               </w:rPr>
               <w:t>0</w:t>
@@ -859,38 +1545,90 @@
         <w:spacing w:after="80"/>
       </w:pPr>
     </w:p>
+    <w:tbl>
+      <w:tblPr>
+        <w:tblW w:type="auto" w:w="0"/>
+        <w:jc w:val="center"/>
+        <w:tblLayout w:type="fixed"/>
+        <w:tblLook w:firstColumn="1" w:firstRow="1" w:lastColumn="0" w:lastRow="0" w:noHBand="0" w:noVBand="1" w:val="04A0"/>
+        <w:tblBorders>
+          <w:top w:val="none" w:sz="0" w:space="0"/>
+          <w:left w:val="none" w:sz="0" w:space="0"/>
+          <w:bottom w:val="none" w:sz="0" w:space="0"/>
+          <w:right w:val="none" w:sz="0" w:space="0"/>
+          <w:insideH w:val="none" w:sz="0" w:space="0"/>
+          <w:insideV w:val="none" w:sz="0" w:space="0"/>
+        </w:tblBorders>
+      </w:tblPr>
+      <w:tblGrid>
+        <w:gridCol w:w="9458"/>
+      </w:tblGrid>
+      <w:tr>
+        <w:tc>
+          <w:tcPr>
+            <w:tcW w:type="dxa" w:w="9936"/>
+            <w:shd w:val="clear" w:fill="ECF5F9"/>
+            <w:tcMar>
+              <w:top w:w="90" w:type="dxa"/>
+              <w:start w:w="130" w:type="dxa"/>
+              <w:bottom w:w="90" w:type="dxa"/>
+              <w:end w:w="130" w:type="dxa"/>
+            </w:tcMar>
+          </w:tcPr>
+          <w:p>
+            <w:pPr>
+              <w:spacing w:after="0"/>
+              <w:pBdr>
+                <w:left w:val="single" w:sz="18" w:space="6" w:color="2C7A9E"/>
+              </w:pBdr>
+            </w:pPr>
+            <w:r>
+              <w:rPr>
+                <w:b w:val="0"/>
+                <w:i/>
+                <w:color w:val="232B33"/>
+                <w:sz w:val="17"/>
+              </w:rPr>
+              <w:t>Warm loads against the live deployment. One cold load after a deploy reached 4184 ms at 1440 px — the upstream image optimiser documented in section A, not the site.</w:t>
+            </w:r>
+          </w:p>
+        </w:tc>
+      </w:tr>
+    </w:tbl>
     <w:p>
       <w:pPr>
-        <w:spacing w:after="120" w:line="288" w:lineRule="auto"/>
-        <w:jc w:val="center"/>
+        <w:spacing w:before="320" w:after="140"/>
+        <w:pBdr>
+          <w:bottom w:val="single" w:sz="12" w:space="4" w:color="2C7A9E"/>
+        </w:pBdr>
       </w:pPr>
       <w:r>
         <w:rPr>
-          <w:i/>
-          <w:sz w:val="16"/>
+          <w:b/>
+          <w:i w:val="0"/>
+          <w:color w:val="2C7A9E"/>
+          <w:sz w:val="28"/>
         </w:rPr>
-        <w:t>Warm loads against the live deployment. One cold load after a deploy reached 4184 ms at 1440 px — the upstream image optimiser documented in section A, not the site.</w:t>
+        <w:t xml:space="preserve">B. </w:t>
+      </w:r>
+      <w:r>
+        <w:rPr>
+          <w:b/>
+          <w:i w:val="0"/>
+          <w:color w:val="0F2334"/>
+          <w:sz w:val="28"/>
+        </w:rPr>
+        <w:t>— Accessibility</w:t>
       </w:r>
     </w:p>
     <w:p>
       <w:pPr>
-        <w:spacing w:before="280" w:after="80"/>
+        <w:spacing w:after="120" w:line="293" w:lineRule="auto"/>
+        <w:jc w:val="both"/>
       </w:pPr>
       <w:r>
         <w:rPr>
-          <w:b/>
-          <w:color w:val="0F2334"/>
-          <w:sz w:val="28"/>
-        </w:rPr>
-        <w:t>B. Accessibility</w:t>
-      </w:r>
-    </w:p>
-    <w:p>
-      <w:pPr>
-        <w:spacing w:after="120" w:line="288" w:lineRule="auto"/>
-      </w:pPr>
-      <w:r>
-        <w:rPr>
+          <w:b w:val="0"/>
           <w:i w:val="0"/>
           <w:sz w:val="19"/>
         </w:rPr>
@@ -899,23 +1637,38 @@
     </w:p>
     <w:p>
       <w:pPr>
-        <w:spacing w:before="280" w:after="80"/>
+        <w:spacing w:before="320" w:after="140"/>
+        <w:pBdr>
+          <w:bottom w:val="single" w:sz="12" w:space="4" w:color="2C7A9E"/>
+        </w:pBdr>
       </w:pPr>
       <w:r>
         <w:rPr>
           <w:b/>
+          <w:i w:val="0"/>
+          <w:color w:val="2C7A9E"/>
+          <w:sz w:val="28"/>
+        </w:rPr>
+        <w:t xml:space="preserve">C. </w:t>
+      </w:r>
+      <w:r>
+        <w:rPr>
+          <w:b/>
+          <w:i w:val="0"/>
           <w:color w:val="0F2334"/>
           <w:sz w:val="28"/>
         </w:rPr>
-        <w:t>C. First paint and loading resilience</w:t>
+        <w:t>— First paint and loading resilience</w:t>
       </w:r>
     </w:p>
     <w:p>
       <w:pPr>
-        <w:spacing w:after="120" w:line="288" w:lineRule="auto"/>
+        <w:spacing w:after="120" w:line="293" w:lineRule="auto"/>
+        <w:jc w:val="both"/>
       </w:pPr>
       <w:r>
         <w:rPr>
+          <w:b w:val="0"/>
           <w:i w:val="0"/>
           <w:sz w:val="19"/>
         </w:rPr>
@@ -924,23 +1677,38 @@
     </w:p>
     <w:p>
       <w:pPr>
-        <w:spacing w:before="280" w:after="80"/>
+        <w:spacing w:before="320" w:after="140"/>
+        <w:pBdr>
+          <w:bottom w:val="single" w:sz="12" w:space="4" w:color="2C7A9E"/>
+        </w:pBdr>
       </w:pPr>
       <w:r>
         <w:rPr>
           <w:b/>
+          <w:i w:val="0"/>
+          <w:color w:val="2C7A9E"/>
+          <w:sz w:val="28"/>
+        </w:rPr>
+        <w:t xml:space="preserve">D. </w:t>
+      </w:r>
+      <w:r>
+        <w:rPr>
+          <w:b/>
+          <w:i w:val="0"/>
           <w:color w:val="0F2334"/>
           <w:sz w:val="28"/>
         </w:rPr>
-        <w:t>D. Search engine optimisation</w:t>
+        <w:t>— Search engine optimisation</w:t>
       </w:r>
     </w:p>
     <w:p>
       <w:pPr>
-        <w:spacing w:after="120" w:line="288" w:lineRule="auto"/>
+        <w:spacing w:after="120" w:line="293" w:lineRule="auto"/>
+        <w:jc w:val="both"/>
       </w:pPr>
       <w:r>
         <w:rPr>
+          <w:b w:val="0"/>
           <w:i w:val="0"/>
           <w:sz w:val="19"/>
         </w:rPr>
@@ -949,23 +1717,38 @@
     </w:p>
     <w:p>
       <w:pPr>
-        <w:spacing w:before="280" w:after="80"/>
+        <w:spacing w:before="320" w:after="140"/>
+        <w:pBdr>
+          <w:bottom w:val="single" w:sz="12" w:space="4" w:color="2C7A9E"/>
+        </w:pBdr>
       </w:pPr>
       <w:r>
         <w:rPr>
           <w:b/>
+          <w:i w:val="0"/>
+          <w:color w:val="2C7A9E"/>
+          <w:sz w:val="28"/>
+        </w:rPr>
+        <w:t xml:space="preserve">E. </w:t>
+      </w:r>
+      <w:r>
+        <w:rPr>
+          <w:b/>
+          <w:i w:val="0"/>
           <w:color w:val="0F2334"/>
           <w:sz w:val="28"/>
         </w:rPr>
-        <w:t>E. Internationalisation and RTL</w:t>
+        <w:t>— Internationalisation and RTL</w:t>
       </w:r>
     </w:p>
     <w:p>
       <w:pPr>
-        <w:spacing w:after="120" w:line="288" w:lineRule="auto"/>
+        <w:spacing w:after="120" w:line="293" w:lineRule="auto"/>
+        <w:jc w:val="both"/>
       </w:pPr>
       <w:r>
         <w:rPr>
+          <w:b w:val="0"/>
           <w:i w:val="0"/>
           <w:sz w:val="19"/>
         </w:rPr>
@@ -974,23 +1757,38 @@
     </w:p>
     <w:p>
       <w:pPr>
-        <w:spacing w:before="280" w:after="80"/>
+        <w:spacing w:before="320" w:after="140"/>
+        <w:pBdr>
+          <w:bottom w:val="single" w:sz="12" w:space="4" w:color="2C7A9E"/>
+        </w:pBdr>
       </w:pPr>
       <w:r>
         <w:rPr>
           <w:b/>
+          <w:i w:val="0"/>
+          <w:color w:val="2C7A9E"/>
+          <w:sz w:val="28"/>
+        </w:rPr>
+        <w:t xml:space="preserve">F. </w:t>
+      </w:r>
+      <w:r>
+        <w:rPr>
+          <w:b/>
+          <w:i w:val="0"/>
           <w:color w:val="0F2334"/>
           <w:sz w:val="28"/>
         </w:rPr>
-        <w:t>F. Links, routing and error handling</w:t>
+        <w:t>— Links, routing and error handling</w:t>
       </w:r>
     </w:p>
     <w:p>
       <w:pPr>
-        <w:spacing w:after="120" w:line="288" w:lineRule="auto"/>
+        <w:spacing w:after="120" w:line="293" w:lineRule="auto"/>
+        <w:jc w:val="both"/>
       </w:pPr>
       <w:r>
         <w:rPr>
+          <w:b w:val="0"/>
           <w:i w:val="0"/>
           <w:sz w:val="19"/>
         </w:rPr>
@@ -999,48 +1797,78 @@
     </w:p>
     <w:p>
       <w:pPr>
-        <w:spacing w:before="280" w:after="80"/>
+        <w:spacing w:before="320" w:after="140"/>
+        <w:pBdr>
+          <w:bottom w:val="single" w:sz="12" w:space="4" w:color="2C7A9E"/>
+        </w:pBdr>
       </w:pPr>
       <w:r>
         <w:rPr>
           <w:b/>
+          <w:i w:val="0"/>
+          <w:color w:val="2C7A9E"/>
+          <w:sz w:val="28"/>
+        </w:rPr>
+        <w:t xml:space="preserve">G. </w:t>
+      </w:r>
+      <w:r>
+        <w:rPr>
+          <w:b/>
+          <w:i w:val="0"/>
           <w:color w:val="0F2334"/>
           <w:sz w:val="28"/>
         </w:rPr>
-        <w:t>G. Security</w:t>
+        <w:t>— Security</w:t>
       </w:r>
     </w:p>
     <w:p>
       <w:pPr>
-        <w:spacing w:after="120" w:line="288" w:lineRule="auto"/>
+        <w:spacing w:after="120" w:line="293" w:lineRule="auto"/>
+        <w:jc w:val="both"/>
       </w:pPr>
       <w:r>
         <w:rPr>
+          <w:b w:val="0"/>
           <w:i w:val="0"/>
           <w:sz w:val="19"/>
         </w:rPr>
-        <w:t>A per-request nonce is generated in src/proxy.ts and applied with strict-dynamic, which is why every route must stay dynamically rendered; converting a page to static output would strip the nonce and cause the browser to block the page. The policy allows the Google Maps frame and Unsplash images and nothing else, with object-src none, base-uri self, form-action self and frame-ancestors none. X-Frame-Options DENY, X-Content-Type-Options nosniff, Referrer-Policy and Permissions-Policy are all set. npm audit reports 0 vulnerabilities, and no console or CSP violation was observed on any route/locale combination.</w:t>
+        <w:t>A per-request nonce is generated in src/proxy.ts and applied with strict-dynamic, which is why every route must stay dynamically rendered; converting a page to static output would strip the nonce and cause the browser to block the page. The policy allows the Google Maps frame, images from Unsplash, and the packaged Fontshare typeface, and nothing else: the Arabic font is now self-hosted in public/fonts, and the Google Fonts hosts dropped out of the style-src and font-src lists with it. object-src none, base-uri self, form-action self and frame-ancestors none are set, as are X-Frame-Options DENY, X-Content-Type-Options nosniff, Referrer-Policy and Permissions-Policy. A dedicated console pass confirmed that the “unrecognized feature” Permissions-Policy entries and the gen_204 ERR_BLOCKED_BY_CLIENT shown by devtools belong to the Google Maps embed and its csp-test probe, not to this site. npm audit reports 0 vulnerabilities, and no console or CSP violation was observed on any route/locale combination.</w:t>
       </w:r>
     </w:p>
     <w:p>
       <w:pPr>
-        <w:spacing w:before="280" w:after="80"/>
+        <w:spacing w:before="320" w:after="140"/>
+        <w:pBdr>
+          <w:bottom w:val="single" w:sz="12" w:space="4" w:color="2C7A9E"/>
+        </w:pBdr>
       </w:pPr>
       <w:r>
         <w:rPr>
           <w:b/>
+          <w:i w:val="0"/>
+          <w:color w:val="2C7A9E"/>
+          <w:sz w:val="28"/>
+        </w:rPr>
+        <w:t xml:space="preserve">H. </w:t>
+      </w:r>
+      <w:r>
+        <w:rPr>
+          <w:b/>
+          <w:i w:val="0"/>
           <w:color w:val="0F2334"/>
           <w:sz w:val="28"/>
         </w:rPr>
-        <w:t>H. Responsive layout</w:t>
+        <w:t>— Responsive layout</w:t>
       </w:r>
     </w:p>
     <w:p>
       <w:pPr>
-        <w:spacing w:after="120" w:line="288" w:lineRule="auto"/>
+        <w:spacing w:after="120" w:line="293" w:lineRule="auto"/>
+        <w:jc w:val="both"/>
       </w:pPr>
       <w:r>
         <w:rPr>
+          <w:b w:val="0"/>
           <w:i w:val="0"/>
           <w:sz w:val="19"/>
         </w:rPr>
@@ -1049,23 +1877,38 @@
     </w:p>
     <w:p>
       <w:pPr>
-        <w:spacing w:before="280" w:after="80"/>
+        <w:spacing w:before="320" w:after="140"/>
+        <w:pBdr>
+          <w:bottom w:val="single" w:sz="12" w:space="4" w:color="2C7A9E"/>
+        </w:pBdr>
       </w:pPr>
       <w:r>
         <w:rPr>
           <w:b/>
+          <w:i w:val="0"/>
+          <w:color w:val="2C7A9E"/>
+          <w:sz w:val="28"/>
+        </w:rPr>
+        <w:t xml:space="preserve">I. </w:t>
+      </w:r>
+      <w:r>
+        <w:rPr>
+          <w:b/>
+          <w:i w:val="0"/>
           <w:color w:val="0F2334"/>
           <w:sz w:val="28"/>
         </w:rPr>
-        <w:t>I. Design and composition</w:t>
+        <w:t>— Design and composition</w:t>
       </w:r>
     </w:p>
     <w:p>
       <w:pPr>
-        <w:spacing w:after="120" w:line="288" w:lineRule="auto"/>
+        <w:spacing w:after="120" w:line="293" w:lineRule="auto"/>
+        <w:jc w:val="both"/>
       </w:pPr>
       <w:r>
         <w:rPr>
+          <w:b w:val="0"/>
           <w:i w:val="0"/>
           <w:sz w:val="19"/>
         </w:rPr>
@@ -1080,12 +1923,12 @@
         <w:tblLook w:firstColumn="1" w:firstRow="1" w:lastColumn="0" w:lastRow="0" w:noHBand="0" w:noVBand="1" w:val="04A0"/>
       </w:tblPr>
       <w:tblGrid>
-        <w:gridCol w:w="1680"/>
-        <w:gridCol w:w="1680"/>
-        <w:gridCol w:w="1680"/>
-        <w:gridCol w:w="1680"/>
-        <w:gridCol w:w="1680"/>
-        <w:gridCol w:w="1680"/>
+        <w:gridCol w:w="1576"/>
+        <w:gridCol w:w="1576"/>
+        <w:gridCol w:w="1576"/>
+        <w:gridCol w:w="1576"/>
+        <w:gridCol w:w="1576"/>
+        <w:gridCol w:w="1576"/>
       </w:tblGrid>
       <w:tr>
         <w:tc>
@@ -1097,11 +1940,18 @@
             <w:pPr>
               <w:spacing w:after="20" w:before="20"/>
             </w:pPr>
-            <w:r/>
             <w:r>
               <w:rPr>
                 <w:b/>
+                <w:i w:val="0"/>
                 <w:color w:val="FFFFFF"/>
+                <w:sz w:val="17"/>
+              </w:rPr>
+            </w:r>
+            <w:r>
+              <w:rPr>
+                <w:b w:val="0"/>
+                <w:i w:val="0"/>
                 <w:sz w:val="17"/>
               </w:rPr>
               <w:t>#</w:t>
@@ -1117,11 +1967,18 @@
             <w:pPr>
               <w:spacing w:after="20" w:before="20"/>
             </w:pPr>
-            <w:r/>
             <w:r>
               <w:rPr>
                 <w:b/>
+                <w:i w:val="0"/>
                 <w:color w:val="FFFFFF"/>
+                <w:sz w:val="17"/>
+              </w:rPr>
+            </w:r>
+            <w:r>
+              <w:rPr>
+                <w:b w:val="0"/>
+                <w:i w:val="0"/>
                 <w:sz w:val="17"/>
               </w:rPr>
               <w:t>Section</w:t>
@@ -1137,11 +1994,18 @@
             <w:pPr>
               <w:spacing w:after="20" w:before="20"/>
             </w:pPr>
-            <w:r/>
             <w:r>
               <w:rPr>
                 <w:b/>
+                <w:i w:val="0"/>
                 <w:color w:val="FFFFFF"/>
+                <w:sz w:val="17"/>
+              </w:rPr>
+            </w:r>
+            <w:r>
+              <w:rPr>
+                <w:b w:val="0"/>
+                <w:i w:val="0"/>
                 <w:sz w:val="17"/>
               </w:rPr>
               <w:t>Height px</w:t>
@@ -1157,11 +2021,18 @@
             <w:pPr>
               <w:spacing w:after="20" w:before="20"/>
             </w:pPr>
-            <w:r/>
             <w:r>
               <w:rPr>
                 <w:b/>
+                <w:i w:val="0"/>
                 <w:color w:val="FFFFFF"/>
+                <w:sz w:val="17"/>
+              </w:rPr>
+            </w:r>
+            <w:r>
+              <w:rPr>
+                <w:b w:val="0"/>
+                <w:i w:val="0"/>
                 <w:sz w:val="17"/>
               </w:rPr>
               <w:t>Image area %</w:t>
@@ -1177,11 +2048,18 @@
             <w:pPr>
               <w:spacing w:after="20" w:before="20"/>
             </w:pPr>
-            <w:r/>
             <w:r>
               <w:rPr>
                 <w:b/>
+                <w:i w:val="0"/>
                 <w:color w:val="FFFFFF"/>
+                <w:sz w:val="17"/>
+              </w:rPr>
+            </w:r>
+            <w:r>
+              <w:rPr>
+                <w:b w:val="0"/>
+                <w:i w:val="0"/>
                 <w:sz w:val="17"/>
               </w:rPr>
               <w:t>Images</w:t>
@@ -1197,11 +2075,18 @@
             <w:pPr>
               <w:spacing w:after="20" w:before="20"/>
             </w:pPr>
-            <w:r/>
             <w:r>
               <w:rPr>
                 <w:b/>
+                <w:i w:val="0"/>
                 <w:color w:val="FFFFFF"/>
+                <w:sz w:val="17"/>
+              </w:rPr>
+            </w:r>
+            <w:r>
+              <w:rPr>
+                <w:b w:val="0"/>
+                <w:i w:val="0"/>
                 <w:sz w:val="17"/>
               </w:rPr>
               <w:t>Background</w:t>
@@ -1221,6 +2106,8 @@
             <w:r/>
             <w:r>
               <w:rPr>
+                <w:b w:val="0"/>
+                <w:i w:val="0"/>
                 <w:sz w:val="17"/>
               </w:rPr>
               <w:t>0</w:t>
@@ -1238,6 +2125,8 @@
             <w:r/>
             <w:r>
               <w:rPr>
+                <w:b w:val="0"/>
+                <w:i w:val="0"/>
                 <w:sz w:val="17"/>
               </w:rPr>
               <w:t>Hero — A Fresh Moment</w:t>
@@ -1255,6 +2144,8 @@
             <w:r/>
             <w:r>
               <w:rPr>
+                <w:b w:val="0"/>
+                <w:i w:val="0"/>
                 <w:sz w:val="17"/>
               </w:rPr>
               <w:t>792</w:t>
@@ -1272,6 +2163,8 @@
             <w:r/>
             <w:r>
               <w:rPr>
+                <w:b w:val="0"/>
+                <w:i w:val="0"/>
                 <w:sz w:val="17"/>
               </w:rPr>
               <w:t>1</w:t>
@@ -1289,6 +2182,8 @@
             <w:r/>
             <w:r>
               <w:rPr>
+                <w:b w:val="0"/>
+                <w:i w:val="0"/>
                 <w:sz w:val="17"/>
               </w:rPr>
               <w:t>100</w:t>
@@ -1306,6 +2201,8 @@
             <w:r/>
             <w:r>
               <w:rPr>
+                <w:b w:val="0"/>
+                <w:i w:val="0"/>
                 <w:sz w:val="17"/>
               </w:rPr>
               <w:t>bloo-950</w:t>
@@ -1326,6 +2223,8 @@
             <w:r/>
             <w:r>
               <w:rPr>
+                <w:b w:val="0"/>
+                <w:i w:val="0"/>
                 <w:sz w:val="17"/>
               </w:rPr>
               <w:t>1</w:t>
@@ -1344,6 +2243,8 @@
             <w:r/>
             <w:r>
               <w:rPr>
+                <w:b w:val="0"/>
+                <w:i w:val="0"/>
                 <w:sz w:val="17"/>
               </w:rPr>
               <w:t>Offerings — Crafted with Precision</w:t>
@@ -1362,6 +2263,8 @@
             <w:r/>
             <w:r>
               <w:rPr>
+                <w:b w:val="0"/>
+                <w:i w:val="0"/>
                 <w:sz w:val="17"/>
               </w:rPr>
               <w:t>1161</w:t>
@@ -1380,6 +2283,8 @@
             <w:r/>
             <w:r>
               <w:rPr>
+                <w:b w:val="0"/>
+                <w:i w:val="0"/>
                 <w:sz w:val="17"/>
               </w:rPr>
               <w:t>1</w:t>
@@ -1398,6 +2303,8 @@
             <w:r/>
             <w:r>
               <w:rPr>
+                <w:b w:val="0"/>
+                <w:i w:val="0"/>
                 <w:sz w:val="17"/>
               </w:rPr>
               <w:t>20.2</w:t>
@@ -1416,6 +2323,8 @@
             <w:r/>
             <w:r>
               <w:rPr>
+                <w:b w:val="0"/>
+                <w:i w:val="0"/>
                 <w:sz w:val="17"/>
               </w:rPr>
               <w:t>cream</w:t>
@@ -1435,6 +2344,8 @@
             <w:r/>
             <w:r>
               <w:rPr>
+                <w:b w:val="0"/>
+                <w:i w:val="0"/>
                 <w:sz w:val="17"/>
               </w:rPr>
               <w:t>2</w:t>
@@ -1452,6 +2363,8 @@
             <w:r/>
             <w:r>
               <w:rPr>
+                <w:b w:val="0"/>
+                <w:i w:val="0"/>
                 <w:sz w:val="17"/>
               </w:rPr>
               <w:t>Signature Tastes</w:t>
@@ -1469,6 +2382,8 @@
             <w:r/>
             <w:r>
               <w:rPr>
+                <w:b w:val="0"/>
+                <w:i w:val="0"/>
                 <w:sz w:val="17"/>
               </w:rPr>
               <w:t>566</w:t>
@@ -1486,6 +2401,8 @@
             <w:r/>
             <w:r>
               <w:rPr>
+                <w:b w:val="0"/>
+                <w:i w:val="0"/>
                 <w:sz w:val="17"/>
               </w:rPr>
               <w:t>1</w:t>
@@ -1503,6 +2420,8 @@
             <w:r/>
             <w:r>
               <w:rPr>
+                <w:b w:val="0"/>
+                <w:i w:val="0"/>
                 <w:sz w:val="17"/>
               </w:rPr>
               <w:t>100</w:t>
@@ -1520,6 +2439,8 @@
             <w:r/>
             <w:r>
               <w:rPr>
+                <w:b w:val="0"/>
+                <w:i w:val="0"/>
                 <w:sz w:val="17"/>
               </w:rPr>
               <w:t>bloo-950</w:t>
@@ -1540,6 +2461,8 @@
             <w:r/>
             <w:r>
               <w:rPr>
+                <w:b w:val="0"/>
+                <w:i w:val="0"/>
                 <w:sz w:val="17"/>
               </w:rPr>
               <w:t>3</w:t>
@@ -1558,6 +2481,8 @@
             <w:r/>
             <w:r>
               <w:rPr>
+                <w:b w:val="0"/>
+                <w:i w:val="0"/>
                 <w:sz w:val="17"/>
               </w:rPr>
               <w:t>Good to Know</w:t>
@@ -1576,6 +2501,8 @@
             <w:r/>
             <w:r>
               <w:rPr>
+                <w:b w:val="0"/>
+                <w:i w:val="0"/>
                 <w:sz w:val="17"/>
               </w:rPr>
               <w:t>628</w:t>
@@ -1594,6 +2521,8 @@
             <w:r/>
             <w:r>
               <w:rPr>
+                <w:b w:val="0"/>
+                <w:i w:val="0"/>
                 <w:sz w:val="17"/>
               </w:rPr>
               <w:t>1</w:t>
@@ -1612,6 +2541,8 @@
             <w:r/>
             <w:r>
               <w:rPr>
+                <w:b w:val="0"/>
+                <w:i w:val="0"/>
                 <w:sz w:val="17"/>
               </w:rPr>
               <w:t>22.1</w:t>
@@ -1630,6 +2561,8 @@
             <w:r/>
             <w:r>
               <w:rPr>
+                <w:b w:val="0"/>
+                <w:i w:val="0"/>
                 <w:sz w:val="17"/>
               </w:rPr>
               <w:t>bloo-950</w:t>
@@ -1649,6 +2582,8 @@
             <w:r/>
             <w:r>
               <w:rPr>
+                <w:b w:val="0"/>
+                <w:i w:val="0"/>
                 <w:sz w:val="17"/>
               </w:rPr>
               <w:t>4</w:t>
@@ -1666,6 +2601,8 @@
             <w:r/>
             <w:r>
               <w:rPr>
+                <w:b w:val="0"/>
+                <w:i w:val="0"/>
                 <w:sz w:val="17"/>
               </w:rPr>
               <w:t>The Space, In Detail</w:t>
@@ -1683,6 +2620,8 @@
             <w:r/>
             <w:r>
               <w:rPr>
+                <w:b w:val="0"/>
+                <w:i w:val="0"/>
                 <w:sz w:val="17"/>
               </w:rPr>
               <w:t>1296</w:t>
@@ -1700,6 +2639,8 @@
             <w:r/>
             <w:r>
               <w:rPr>
+                <w:b w:val="0"/>
+                <w:i w:val="0"/>
                 <w:sz w:val="17"/>
               </w:rPr>
               <w:t>6</w:t>
@@ -1717,6 +2658,8 @@
             <w:r/>
             <w:r>
               <w:rPr>
+                <w:b w:val="0"/>
+                <w:i w:val="0"/>
                 <w:sz w:val="17"/>
               </w:rPr>
               <w:t>48.6</w:t>
@@ -1734,6 +2677,8 @@
             <w:r/>
             <w:r>
               <w:rPr>
+                <w:b w:val="0"/>
+                <w:i w:val="0"/>
                 <w:sz w:val="17"/>
               </w:rPr>
               <w:t>cream</w:t>
@@ -1754,6 +2699,8 @@
             <w:r/>
             <w:r>
               <w:rPr>
+                <w:b w:val="0"/>
+                <w:i w:val="0"/>
                 <w:sz w:val="17"/>
               </w:rPr>
               <w:t>5</w:t>
@@ -1772,6 +2719,8 @@
             <w:r/>
             <w:r>
               <w:rPr>
+                <w:b w:val="0"/>
+                <w:i w:val="0"/>
                 <w:sz w:val="17"/>
               </w:rPr>
               <w:t>Location — Join Us In L'Aouina</w:t>
@@ -1790,6 +2739,8 @@
             <w:r/>
             <w:r>
               <w:rPr>
+                <w:b w:val="0"/>
+                <w:i w:val="0"/>
                 <w:sz w:val="17"/>
               </w:rPr>
               <w:t>1129</w:t>
@@ -1808,6 +2759,8 @@
             <w:r/>
             <w:r>
               <w:rPr>
+                <w:b w:val="0"/>
+                <w:i w:val="0"/>
                 <w:sz w:val="17"/>
               </w:rPr>
               <w:t>1</w:t>
@@ -1826,6 +2779,8 @@
             <w:r/>
             <w:r>
               <w:rPr>
+                <w:b w:val="0"/>
+                <w:i w:val="0"/>
                 <w:sz w:val="17"/>
               </w:rPr>
               <w:t>13.6</w:t>
@@ -1844,6 +2799,8 @@
             <w:r/>
             <w:r>
               <w:rPr>
+                <w:b w:val="0"/>
+                <w:i w:val="0"/>
                 <w:sz w:val="17"/>
               </w:rPr>
               <w:t>white</w:t>
@@ -1863,6 +2820,8 @@
             <w:r/>
             <w:r>
               <w:rPr>
+                <w:b w:val="0"/>
+                <w:i w:val="0"/>
                 <w:sz w:val="17"/>
               </w:rPr>
               <w:t>6</w:t>
@@ -1880,6 +2839,8 @@
             <w:r/>
             <w:r>
               <w:rPr>
+                <w:b w:val="0"/>
+                <w:i w:val="0"/>
                 <w:sz w:val="17"/>
               </w:rPr>
               <w:t>What Guests Say</w:t>
@@ -1897,6 +2858,8 @@
             <w:r/>
             <w:r>
               <w:rPr>
+                <w:b w:val="0"/>
+                <w:i w:val="0"/>
                 <w:sz w:val="17"/>
               </w:rPr>
               <w:t>432</w:t>
@@ -1914,6 +2877,8 @@
             <w:r/>
             <w:r>
               <w:rPr>
+                <w:b w:val="0"/>
+                <w:i w:val="0"/>
                 <w:sz w:val="17"/>
               </w:rPr>
               <w:t>0</w:t>
@@ -1931,6 +2896,8 @@
             <w:r/>
             <w:r>
               <w:rPr>
+                <w:b w:val="0"/>
+                <w:i w:val="0"/>
                 <w:sz w:val="17"/>
               </w:rPr>
               <w:t>0</w:t>
@@ -1948,6 +2915,8 @@
             <w:r/>
             <w:r>
               <w:rPr>
+                <w:b w:val="0"/>
+                <w:i w:val="0"/>
                 <w:sz w:val="17"/>
               </w:rPr>
               <w:t>bloo-950</w:t>
@@ -1968,6 +2937,8 @@
             <w:r/>
             <w:r>
               <w:rPr>
+                <w:b w:val="0"/>
+                <w:i w:val="0"/>
                 <w:sz w:val="17"/>
               </w:rPr>
               <w:t>7</w:t>
@@ -1986,6 +2957,8 @@
             <w:r/>
             <w:r>
               <w:rPr>
+                <w:b w:val="0"/>
+                <w:i w:val="0"/>
                 <w:sz w:val="17"/>
               </w:rPr>
               <w:t>@bloo.coffeeshop</w:t>
@@ -2004,6 +2977,8 @@
             <w:r/>
             <w:r>
               <w:rPr>
+                <w:b w:val="0"/>
+                <w:i w:val="0"/>
                 <w:sz w:val="17"/>
               </w:rPr>
               <w:t>848</w:t>
@@ -2022,6 +2997,8 @@
             <w:r/>
             <w:r>
               <w:rPr>
+                <w:b w:val="0"/>
+                <w:i w:val="0"/>
                 <w:sz w:val="17"/>
               </w:rPr>
               <w:t>6</w:t>
@@ -2040,6 +3017,8 @@
             <w:r/>
             <w:r>
               <w:rPr>
+                <w:b w:val="0"/>
+                <w:i w:val="0"/>
                 <w:sz w:val="17"/>
               </w:rPr>
               <w:t>23.1</w:t>
@@ -2058,6 +3037,8 @@
             <w:r/>
             <w:r>
               <w:rPr>
+                <w:b w:val="0"/>
+                <w:i w:val="0"/>
                 <w:sz w:val="17"/>
               </w:rPr>
               <w:t>cream</w:t>
@@ -2077,6 +3058,8 @@
             <w:r/>
             <w:r>
               <w:rPr>
+                <w:b w:val="0"/>
+                <w:i w:val="0"/>
                 <w:sz w:val="17"/>
               </w:rPr>
             </w:r>
@@ -2093,6 +3076,8 @@
             <w:r/>
             <w:r>
               <w:rPr>
+                <w:b w:val="0"/>
+                <w:i w:val="0"/>
                 <w:sz w:val="17"/>
               </w:rPr>
               <w:t>Weighted image coverage</w:t>
@@ -2110,6 +3095,8 @@
             <w:r/>
             <w:r>
               <w:rPr>
+                <w:b w:val="0"/>
+                <w:i w:val="0"/>
                 <w:sz w:val="17"/>
               </w:rPr>
             </w:r>
@@ -2126,6 +3113,8 @@
             <w:r/>
             <w:r>
               <w:rPr>
+                <w:b w:val="0"/>
+                <w:i w:val="0"/>
                 <w:sz w:val="17"/>
               </w:rPr>
               <w:t>39.6%</w:t>
@@ -2143,6 +3132,8 @@
             <w:r/>
             <w:r>
               <w:rPr>
+                <w:b w:val="0"/>
+                <w:i w:val="0"/>
                 <w:sz w:val="17"/>
               </w:rPr>
             </w:r>
@@ -2159,6 +3150,8 @@
             <w:r/>
             <w:r>
               <w:rPr>
+                <w:b w:val="0"/>
+                <w:i w:val="0"/>
                 <w:sz w:val="17"/>
               </w:rPr>
             </w:r>
@@ -2173,505 +3166,2118 @@
     </w:p>
     <w:p>
       <w:pPr>
-        <w:spacing w:before="280" w:after="80"/>
+        <w:spacing w:before="240" w:after="100"/>
+        <w:pBdr>
+          <w:bottom w:val="single" w:sz="12" w:space="4" w:color="2C7A9E"/>
+        </w:pBdr>
       </w:pPr>
       <w:r>
         <w:rPr>
           <w:b/>
+          <w:i w:val="0"/>
           <w:color w:val="0F2334"/>
-          <w:sz w:val="28"/>
+          <w:sz w:val="30"/>
         </w:rPr>
         <w:t>Outstanding items</w:t>
       </w:r>
     </w:p>
+    <w:tbl>
+      <w:tblPr>
+        <w:tblW w:type="auto" w:w="0"/>
+        <w:jc w:val="center"/>
+        <w:tblLayout w:type="fixed"/>
+        <w:tblLook w:firstColumn="1" w:firstRow="1" w:lastColumn="0" w:lastRow="0" w:noHBand="0" w:noVBand="1" w:val="04A0"/>
+        <w:tblBorders>
+          <w:top w:val="none" w:sz="0" w:space="0"/>
+          <w:left w:val="none" w:sz="0" w:space="0"/>
+          <w:bottom w:val="none" w:sz="0" w:space="0"/>
+          <w:right w:val="none" w:sz="0" w:space="0"/>
+          <w:insideH w:val="none" w:sz="0" w:space="0"/>
+          <w:insideV w:val="none" w:sz="0" w:space="0"/>
+        </w:tblBorders>
+      </w:tblPr>
+      <w:tblGrid>
+        <w:gridCol w:w="9458"/>
+      </w:tblGrid>
+      <w:tr>
+        <w:tc>
+          <w:tcPr>
+            <w:tcW w:type="dxa" w:w="9936"/>
+            <w:shd w:val="clear" w:fill="FBF6EA"/>
+            <w:tcMar>
+              <w:top w:w="90" w:type="dxa"/>
+              <w:start w:w="130" w:type="dxa"/>
+              <w:bottom w:w="90" w:type="dxa"/>
+              <w:end w:w="130" w:type="dxa"/>
+            </w:tcMar>
+          </w:tcPr>
+          <w:p>
+            <w:pPr>
+              <w:spacing w:after="0"/>
+              <w:pBdr>
+                <w:left w:val="single" w:sz="18" w:space="6" w:color="B98A2F"/>
+              </w:pBdr>
+            </w:pPr>
+            <w:r>
+              <w:rPr>
+                <w:b w:val="0"/>
+                <w:i/>
+                <w:color w:val="232B33"/>
+                <w:sz w:val="17"/>
+              </w:rPr>
+              <w:t>1. Real photography. Every image is illustrative Unsplash stock. Supplying genuine BLOO COFFEE photography is the highest-value remaining change and is blocked only by asset availability. 2. Self-hosting images. Copying the files into public/ removes the intermittent optimiser timeouts permanently. 3. Visual sign-off. Geometry, contrast, overflow and layout shift are all verified numerically, but the aesthetic judgement of the compositions needs a human eye. 4. Any previously exposed GitHub token must be rotated by its owner.</w:t>
+            </w:r>
+          </w:p>
+        </w:tc>
+      </w:tr>
+    </w:tbl>
     <w:p>
       <w:pPr>
-        <w:spacing w:after="120" w:line="288" w:lineRule="auto"/>
-      </w:pPr>
-      <w:r>
-        <w:rPr>
-          <w:i w:val="0"/>
-          <w:sz w:val="19"/>
-        </w:rPr>
-        <w:t>1. Real photography. Every image is illustrative Unsplash stock. Supplying genuine BLOO COFFEE photography is the highest-value remaining change and is blocked only by asset availability. 2. Self-hosting images. Copying the files into public/ removes the intermittent optimiser timeouts permanently; note that public/images/** is currently gitignored, so that rule must be relaxed deliberately. 3. Visual sign-off. Geometry, contrast, overflow and layout shift are all verified numerically, but the aesthetic judgement of the compositions needs a human eye. 4. Any previously exposed GitHub token must be rotated by its owner.</w:t>
-      </w:r>
-    </w:p>
-    <w:p>
-      <w:pPr>
-        <w:spacing w:before="280" w:after="80"/>
+        <w:spacing w:before="240" w:after="100"/>
+        <w:pBdr>
+          <w:bottom w:val="single" w:sz="12" w:space="4" w:color="2C7A9E"/>
+        </w:pBdr>
       </w:pPr>
       <w:r>
         <w:rPr>
           <w:b/>
+          <w:i w:val="0"/>
           <w:color w:val="0F2334"/>
-          <w:sz w:val="28"/>
+          <w:sz w:val="30"/>
         </w:rPr>
         <w:t>Evidence</w:t>
       </w:r>
     </w:p>
     <w:p>
       <w:pPr>
-        <w:spacing w:after="40"/>
-        <w:jc w:val="center"/>
-      </w:pPr>
-      <w:r>
-        <w:drawing>
-          <wp:inline xmlns:a="http://schemas.openxmlformats.org/drawingml/2006/main" xmlns:pic="http://schemas.openxmlformats.org/drawingml/2006/picture">
-            <wp:extent cx="5760720" cy="3599298"/>
-            <wp:docPr id="1" name="Picture 1"/>
-            <wp:cNvGraphicFramePr>
-              <a:graphicFrameLocks noChangeAspect="1"/>
-            </wp:cNvGraphicFramePr>
-            <a:graphic>
-              <a:graphicData uri="http://schemas.openxmlformats.org/drawingml/2006/picture">
-                <pic:pic>
-                  <pic:nvPicPr>
-                    <pic:cNvPr id="0" name="01-splash-12745.jpg"/>
-                    <pic:cNvPicPr/>
-                  </pic:nvPicPr>
-                  <pic:blipFill>
-                    <a:blip r:embed="rId9"/>
-                    <a:stretch>
-                      <a:fillRect/>
-                    </a:stretch>
-                  </pic:blipFill>
-                  <pic:spPr>
-                    <a:xfrm>
-                      <a:off x="0" y="0"/>
-                      <a:ext cx="5760720" cy="3599298"/>
-                    </a:xfrm>
-                    <a:prstGeom prst="rect"/>
-                  </pic:spPr>
-                </pic:pic>
-              </a:graphicData>
-            </a:graphic>
-          </wp:inline>
-        </w:drawing>
-      </w:r>
-    </w:p>
-    <w:p>
-      <w:pPr>
-        <w:spacing w:after="200"/>
-        <w:jc w:val="center"/>
-      </w:pPr>
-      <w:r>
-        <w:rPr>
-          <w:i/>
-          <w:color w:val="556670"/>
-          <w:sz w:val="16"/>
-        </w:rPr>
-        <w:t>First paint — the server-rendered 3D brand splash, before the client bundle runs.</w:t>
-      </w:r>
-    </w:p>
-    <w:p>
-      <w:pPr>
-        <w:spacing w:after="40"/>
-        <w:jc w:val="center"/>
-      </w:pPr>
-      <w:r>
-        <w:drawing>
-          <wp:inline xmlns:a="http://schemas.openxmlformats.org/drawingml/2006/main" xmlns:pic="http://schemas.openxmlformats.org/drawingml/2006/picture">
-            <wp:extent cx="5760720" cy="3599298"/>
-            <wp:docPr id="2" name="Picture 2"/>
-            <wp:cNvGraphicFramePr>
-              <a:graphicFrameLocks noChangeAspect="1"/>
-            </wp:cNvGraphicFramePr>
-            <a:graphic>
-              <a:graphicData uri="http://schemas.openxmlformats.org/drawingml/2006/picture">
-                <pic:pic>
-                  <pic:nvPicPr>
-                    <pic:cNvPr id="0" name="05-hero-en-1846890.jpg"/>
-                    <pic:cNvPicPr/>
-                  </pic:nvPicPr>
-                  <pic:blipFill>
-                    <a:blip r:embed="rId10"/>
-                    <a:stretch>
-                      <a:fillRect/>
-                    </a:stretch>
-                  </pic:blipFill>
-                  <pic:spPr>
-                    <a:xfrm>
-                      <a:off x="0" y="0"/>
-                      <a:ext cx="5760720" cy="3599298"/>
-                    </a:xfrm>
-                    <a:prstGeom prst="rect"/>
-                  </pic:spPr>
-                </pic:pic>
-              </a:graphicData>
-            </a:graphic>
-          </wp:inline>
-        </w:drawing>
-      </w:r>
-    </w:p>
-    <w:p>
-      <w:pPr>
-        <w:spacing w:after="200"/>
-        <w:jc w:val="center"/>
-      </w:pPr>
-      <w:r>
-        <w:rPr>
-          <w:i/>
-          <w:color w:val="556670"/>
-          <w:sz w:val="16"/>
-        </w:rPr>
-        <w:t>Hero — full-bleed photograph with a strengthened, RTL-aware scrim.</w:t>
-      </w:r>
-    </w:p>
-    <w:p>
-      <w:pPr>
-        <w:spacing w:after="40"/>
-        <w:jc w:val="center"/>
-      </w:pPr>
-      <w:r>
-        <w:drawing>
-          <wp:inline xmlns:a="http://schemas.openxmlformats.org/drawingml/2006/main" xmlns:pic="http://schemas.openxmlformats.org/drawingml/2006/picture">
-            <wp:extent cx="5760720" cy="2511674"/>
-            <wp:docPr id="3" name="Picture 3"/>
-            <wp:cNvGraphicFramePr>
-              <a:graphicFrameLocks noChangeAspect="1"/>
-            </wp:cNvGraphicFramePr>
-            <a:graphic>
-              <a:graphicData uri="http://schemas.openxmlformats.org/drawingml/2006/picture">
-                <pic:pic>
-                  <pic:nvPicPr>
-                    <pic:cNvPr id="0" name="07-goodtoknow-en-461440.jpg"/>
-                    <pic:cNvPicPr/>
-                  </pic:nvPicPr>
-                  <pic:blipFill>
-                    <a:blip r:embed="rId11"/>
-                    <a:stretch>
-                      <a:fillRect/>
-                    </a:stretch>
-                  </pic:blipFill>
-                  <pic:spPr>
-                    <a:xfrm>
-                      <a:off x="0" y="0"/>
-                      <a:ext cx="5760720" cy="2511674"/>
-                    </a:xfrm>
-                    <a:prstGeom prst="rect"/>
-                  </pic:spPr>
-                </pic:pic>
-              </a:graphicData>
-            </a:graphic>
-          </wp:inline>
-        </w:drawing>
-      </w:r>
-    </w:p>
-    <w:p>
-      <w:pPr>
-        <w:spacing w:after="200"/>
-        <w:jc w:val="center"/>
-      </w:pPr>
-      <w:r>
-        <w:rPr>
-          <w:i/>
-          <w:color w:val="556670"/>
-          <w:sz w:val="16"/>
-        </w:rPr>
-        <w:t>Good to Know — photograph 400x500, information column centred beside it with a 64 px gutter.</w:t>
-      </w:r>
-    </w:p>
-    <w:p>
-      <w:pPr>
-        <w:spacing w:after="40"/>
-        <w:jc w:val="center"/>
-      </w:pPr>
-      <w:r>
-        <w:drawing>
-          <wp:inline xmlns:a="http://schemas.openxmlformats.org/drawingml/2006/main" xmlns:pic="http://schemas.openxmlformats.org/drawingml/2006/picture">
-            <wp:extent cx="5760720" cy="1728216"/>
-            <wp:docPr id="4" name="Picture 4"/>
-            <wp:cNvGraphicFramePr>
-              <a:graphicFrameLocks noChangeAspect="1"/>
-            </wp:cNvGraphicFramePr>
-            <a:graphic>
-              <a:graphicData uri="http://schemas.openxmlformats.org/drawingml/2006/picture">
-                <pic:pic>
-                  <pic:nvPicPr>
-                    <pic:cNvPr id="0" name="10-reviews-en-23893.jpg"/>
-                    <pic:cNvPicPr/>
-                  </pic:nvPicPr>
-                  <pic:blipFill>
-                    <a:blip r:embed="rId12"/>
-                    <a:stretch>
-                      <a:fillRect/>
-                    </a:stretch>
-                  </pic:blipFill>
-                  <pic:spPr>
-                    <a:xfrm>
-                      <a:off x="0" y="0"/>
-                      <a:ext cx="5760720" cy="1728216"/>
-                    </a:xfrm>
-                    <a:prstGeom prst="rect"/>
-                  </pic:spPr>
-                </pic:pic>
-              </a:graphicData>
-            </a:graphic>
-          </wp:inline>
-        </w:drawing>
-      </w:r>
-    </w:p>
-    <w:p>
-      <w:pPr>
-        <w:spacing w:after="200"/>
-        <w:jc w:val="center"/>
-      </w:pPr>
-      <w:r>
-        <w:rPr>
-          <w:i/>
-          <w:color w:val="556670"/>
-          <w:sz w:val="16"/>
-        </w:rPr>
-        <w:t>What Guests Say — reduced to a typographic band; the photograph was removed.</w:t>
-      </w:r>
-    </w:p>
-    <w:p>
-      <w:pPr>
-        <w:spacing w:after="40"/>
-        <w:jc w:val="center"/>
-      </w:pPr>
-      <w:r>
-        <w:drawing>
-          <wp:inline xmlns:a="http://schemas.openxmlformats.org/drawingml/2006/main" xmlns:pic="http://schemas.openxmlformats.org/drawingml/2006/picture">
-            <wp:extent cx="5760720" cy="140266146"/>
-            <wp:docPr id="5" name="Picture 5"/>
-            <wp:cNvGraphicFramePr>
-              <a:graphicFrameLocks noChangeAspect="1"/>
-            </wp:cNvGraphicFramePr>
-            <a:graphic>
-              <a:graphicData uri="http://schemas.openxmlformats.org/drawingml/2006/picture">
-                <pic:pic>
-                  <pic:nvPicPr>
-                    <pic:cNvPr id="0" name="17-mobile-home-1484611.jpg"/>
-                    <pic:cNvPicPr/>
-                  </pic:nvPicPr>
-                  <pic:blipFill>
-                    <a:blip r:embed="rId13"/>
-                    <a:stretch>
-                      <a:fillRect/>
-                    </a:stretch>
-                  </pic:blipFill>
-                  <pic:spPr>
-                    <a:xfrm>
-                      <a:off x="0" y="0"/>
-                      <a:ext cx="5760720" cy="140266146"/>
-                    </a:xfrm>
-                    <a:prstGeom prst="rect"/>
-                  </pic:spPr>
-                </pic:pic>
-              </a:graphicData>
-            </a:graphic>
-          </wp:inline>
-        </w:drawing>
-      </w:r>
-    </w:p>
-    <w:p>
-      <w:pPr>
-        <w:spacing w:after="200"/>
-        <w:jc w:val="center"/>
-      </w:pPr>
-      <w:r>
-        <w:rPr>
-          <w:i/>
-          <w:color w:val="556670"/>
-          <w:sz w:val="16"/>
-        </w:rPr>
-        <w:t>Homepage at 390 px.</w:t>
-      </w:r>
-    </w:p>
-    <w:p>
-      <w:pPr>
-        <w:spacing w:after="40"/>
-        <w:jc w:val="center"/>
-      </w:pPr>
-      <w:r>
-        <w:drawing>
-          <wp:inline xmlns:a="http://schemas.openxmlformats.org/drawingml/2006/main" xmlns:pic="http://schemas.openxmlformats.org/drawingml/2006/picture">
-            <wp:extent cx="5760720" cy="13618933"/>
-            <wp:docPr id="6" name="Picture 6"/>
-            <wp:cNvGraphicFramePr>
-              <a:graphicFrameLocks noChangeAspect="1"/>
-            </wp:cNvGraphicFramePr>
-            <a:graphic>
-              <a:graphicData uri="http://schemas.openxmlformats.org/drawingml/2006/picture">
-                <pic:pic>
-                  <pic:nvPicPr>
-                    <pic:cNvPr id="0" name="19-mobile-goodtoknow-301667.jpg"/>
-                    <pic:cNvPicPr/>
-                  </pic:nvPicPr>
-                  <pic:blipFill>
-                    <a:blip r:embed="rId14"/>
-                    <a:stretch>
-                      <a:fillRect/>
-                    </a:stretch>
-                  </pic:blipFill>
-                  <pic:spPr>
-                    <a:xfrm>
-                      <a:off x="0" y="0"/>
-                      <a:ext cx="5760720" cy="13618933"/>
-                    </a:xfrm>
-                    <a:prstGeom prst="rect"/>
-                  </pic:spPr>
-                </pic:pic>
-              </a:graphicData>
-            </a:graphic>
-          </wp:inline>
-        </w:drawing>
-      </w:r>
-    </w:p>
-    <w:p>
-      <w:pPr>
-        <w:spacing w:after="200"/>
-        <w:jc w:val="center"/>
-      </w:pPr>
-      <w:r>
-        <w:rPr>
-          <w:i/>
-          <w:color w:val="556670"/>
-          <w:sz w:val="16"/>
-        </w:rPr>
-        <w:t>Good to Know at 390 px — stacked pair.</w:t>
-      </w:r>
-    </w:p>
-    <w:p>
-      <w:pPr>
-        <w:spacing w:after="40"/>
-        <w:jc w:val="center"/>
-      </w:pPr>
-      <w:r>
-        <w:drawing>
-          <wp:inline xmlns:a="http://schemas.openxmlformats.org/drawingml/2006/main" xmlns:pic="http://schemas.openxmlformats.org/drawingml/2006/picture">
-            <wp:extent cx="5760720" cy="29407323"/>
-            <wp:docPr id="7" name="Picture 7"/>
-            <wp:cNvGraphicFramePr>
-              <a:graphicFrameLocks noChangeAspect="1"/>
-            </wp:cNvGraphicFramePr>
-            <a:graphic>
-              <a:graphicData uri="http://schemas.openxmlformats.org/drawingml/2006/picture">
-                <pic:pic>
-                  <pic:nvPicPr>
-                    <pic:cNvPr id="0" name="02-home-full-en-4569999.jpg"/>
-                    <pic:cNvPicPr/>
-                  </pic:nvPicPr>
-                  <pic:blipFill>
-                    <a:blip r:embed="rId15"/>
-                    <a:stretch>
-                      <a:fillRect/>
-                    </a:stretch>
-                  </pic:blipFill>
-                  <pic:spPr>
-                    <a:xfrm>
-                      <a:off x="0" y="0"/>
-                      <a:ext cx="5760720" cy="29407323"/>
-                    </a:xfrm>
-                    <a:prstGeom prst="rect"/>
-                  </pic:spPr>
-                </pic:pic>
-              </a:graphicData>
-            </a:graphic>
-          </wp:inline>
-        </w:drawing>
-      </w:r>
-    </w:p>
-    <w:p>
-      <w:pPr>
-        <w:spacing w:after="200"/>
-        <w:jc w:val="center"/>
-      </w:pPr>
-      <w:r>
-        <w:rPr>
-          <w:i/>
-          <w:color w:val="556670"/>
-          <w:sz w:val="16"/>
-        </w:rPr>
-        <w:t>Full homepage, English.</w:t>
-      </w:r>
-    </w:p>
-    <w:p>
-      <w:pPr>
-        <w:spacing w:before="280" w:after="80"/>
+        <w:spacing w:before="240" w:after="100"/>
       </w:pPr>
       <w:r>
         <w:rPr>
           <w:b/>
+          <w:i w:val="0"/>
+          <w:color w:val="0F2334"/>
+          <w:sz w:val="23"/>
+        </w:rPr>
+        <w:t>Composition details</w:t>
+      </w:r>
+    </w:p>
+    <w:tbl>
+      <w:tblPr>
+        <w:tblStyle w:val="TableGrid"/>
+        <w:tblW w:type="auto" w:w="0"/>
+        <w:jc w:val="center"/>
+        <w:tblLook w:firstColumn="1" w:firstRow="1" w:lastColumn="0" w:lastRow="0" w:noHBand="0" w:noVBand="1" w:val="04A0"/>
+        <w:tblBorders>
+          <w:top w:val="none" w:sz="0" w:space="0"/>
+          <w:left w:val="none" w:sz="0" w:space="0"/>
+          <w:bottom w:val="none" w:sz="0" w:space="0"/>
+          <w:right w:val="none" w:sz="0" w:space="0"/>
+          <w:insideH w:val="none" w:sz="0" w:space="0"/>
+          <w:insideV w:val="none" w:sz="0" w:space="0"/>
+        </w:tblBorders>
+      </w:tblPr>
+      <w:tblGrid>
+        <w:gridCol w:w="4729"/>
+        <w:gridCol w:w="4729"/>
+      </w:tblGrid>
+      <w:tr>
+        <w:tc>
+          <w:tcPr>
+            <w:tcW w:type="dxa" w:w="4729"/>
+            <w:tcMar>
+              <w:top w:w="60" w:type="dxa"/>
+              <w:start w:w="60" w:type="dxa"/>
+              <w:bottom w:w="60" w:type="dxa"/>
+              <w:end w:w="60" w:type="dxa"/>
+            </w:tcMar>
+          </w:tcPr>
+          <w:p>
+            <w:pPr>
+              <w:spacing w:after="20"/>
+              <w:jc w:val="center"/>
+            </w:pPr>
+            <w:r>
+              <w:drawing>
+                <wp:inline xmlns:a="http://schemas.openxmlformats.org/drawingml/2006/main" xmlns:pic="http://schemas.openxmlformats.org/drawingml/2006/picture">
+                  <wp:extent cx="2148840" cy="937676"/>
+                  <wp:docPr id="2" name="Picture 2"/>
+                  <wp:cNvGraphicFramePr>
+                    <a:graphicFrameLocks noChangeAspect="1"/>
+                  </wp:cNvGraphicFramePr>
+                  <a:graphic>
+                    <a:graphicData uri="http://schemas.openxmlformats.org/drawingml/2006/picture">
+                      <pic:pic>
+                        <pic:nvPicPr>
+                          <pic:cNvPr id="0" name="detail-goodtoknow-en-255481.jpg"/>
+                          <pic:cNvPicPr/>
+                        </pic:nvPicPr>
+                        <pic:blipFill>
+                          <a:blip r:embed="rId14"/>
+                          <a:stretch>
+                            <a:fillRect/>
+                          </a:stretch>
+                        </pic:blipFill>
+                        <pic:spPr>
+                          <a:xfrm>
+                            <a:off x="0" y="0"/>
+                            <a:ext cx="2148840" cy="937676"/>
+                          </a:xfrm>
+                          <a:prstGeom prst="rect"/>
+                        </pic:spPr>
+                      </pic:pic>
+                    </a:graphicData>
+                  </a:graphic>
+                </wp:inline>
+              </w:drawing>
+            </w:r>
+          </w:p>
+          <w:p>
+            <w:pPr>
+              <w:spacing w:after="0"/>
+              <w:jc w:val="center"/>
+            </w:pPr>
+            <w:r>
+              <w:rPr>
+                <w:b w:val="0"/>
+                <w:i/>
+                <w:color w:val="556670"/>
+                <w:sz w:val="14"/>
+              </w:rPr>
+              <w:t>Good to Know — the centred pair, 400×500 photograph, 64 px gutter.</w:t>
+            </w:r>
+          </w:p>
+        </w:tc>
+        <w:tc>
+          <w:tcPr>
+            <w:tcW w:type="dxa" w:w="4729"/>
+            <w:tcMar>
+              <w:top w:w="60" w:type="dxa"/>
+              <w:start w:w="60" w:type="dxa"/>
+              <w:bottom w:w="60" w:type="dxa"/>
+              <w:end w:w="60" w:type="dxa"/>
+            </w:tcMar>
+          </w:tcPr>
+          <w:p>
+            <w:pPr>
+              <w:spacing w:after="20"/>
+              <w:jc w:val="center"/>
+            </w:pPr>
+            <w:r>
+              <w:drawing>
+                <wp:inline xmlns:a="http://schemas.openxmlformats.org/drawingml/2006/main" xmlns:pic="http://schemas.openxmlformats.org/drawingml/2006/picture">
+                  <wp:extent cx="2148840" cy="937676"/>
+                  <wp:docPr id="3" name="Picture 3"/>
+                  <wp:cNvGraphicFramePr>
+                    <a:graphicFrameLocks noChangeAspect="1"/>
+                  </wp:cNvGraphicFramePr>
+                  <a:graphic>
+                    <a:graphicData uri="http://schemas.openxmlformats.org/drawingml/2006/picture">
+                      <pic:pic>
+                        <pic:nvPicPr>
+                          <pic:cNvPr id="0" name="detail-goodtoknow-ar-249172.jpg"/>
+                          <pic:cNvPicPr/>
+                        </pic:nvPicPr>
+                        <pic:blipFill>
+                          <a:blip r:embed="rId15"/>
+                          <a:stretch>
+                            <a:fillRect/>
+                          </a:stretch>
+                        </pic:blipFill>
+                        <pic:spPr>
+                          <a:xfrm>
+                            <a:off x="0" y="0"/>
+                            <a:ext cx="2148840" cy="937676"/>
+                          </a:xfrm>
+                          <a:prstGeom prst="rect"/>
+                        </pic:spPr>
+                      </pic:pic>
+                    </a:graphicData>
+                  </a:graphic>
+                </wp:inline>
+              </w:drawing>
+            </w:r>
+          </w:p>
+          <w:p>
+            <w:pPr>
+              <w:spacing w:after="0"/>
+              <w:jc w:val="center"/>
+            </w:pPr>
+            <w:r>
+              <w:rPr>
+                <w:b w:val="0"/>
+                <w:i/>
+                <w:color w:val="556670"/>
+                <w:sz w:val="14"/>
+              </w:rPr>
+              <w:t>Same pair under dir=rtl — the order reverses.</w:t>
+            </w:r>
+          </w:p>
+        </w:tc>
+      </w:tr>
+      <w:tr>
+        <w:tc>
+          <w:tcPr>
+            <w:tcW w:type="dxa" w:w="4729"/>
+            <w:tcMar>
+              <w:top w:w="60" w:type="dxa"/>
+              <w:start w:w="60" w:type="dxa"/>
+              <w:bottom w:w="60" w:type="dxa"/>
+              <w:end w:w="60" w:type="dxa"/>
+            </w:tcMar>
+          </w:tcPr>
+          <w:p>
+            <w:pPr>
+              <w:spacing w:after="20"/>
+              <w:jc w:val="center"/>
+            </w:pPr>
+            <w:r>
+              <w:drawing>
+                <wp:inline xmlns:a="http://schemas.openxmlformats.org/drawingml/2006/main" xmlns:pic="http://schemas.openxmlformats.org/drawingml/2006/picture">
+                  <wp:extent cx="2148840" cy="5080078"/>
+                  <wp:docPr id="4" name="Picture 4"/>
+                  <wp:cNvGraphicFramePr>
+                    <a:graphicFrameLocks noChangeAspect="1"/>
+                  </wp:cNvGraphicFramePr>
+                  <a:graphic>
+                    <a:graphicData uri="http://schemas.openxmlformats.org/drawingml/2006/picture">
+                      <pic:pic>
+                        <pic:nvPicPr>
+                          <pic:cNvPr id="0" name="detail-goodtoknow-phone-215029.jpg"/>
+                          <pic:cNvPicPr/>
+                        </pic:nvPicPr>
+                        <pic:blipFill>
+                          <a:blip r:embed="rId16"/>
+                          <a:stretch>
+                            <a:fillRect/>
+                          </a:stretch>
+                        </pic:blipFill>
+                        <pic:spPr>
+                          <a:xfrm>
+                            <a:off x="0" y="0"/>
+                            <a:ext cx="2148840" cy="5080078"/>
+                          </a:xfrm>
+                          <a:prstGeom prst="rect"/>
+                        </pic:spPr>
+                      </pic:pic>
+                    </a:graphicData>
+                  </a:graphic>
+                </wp:inline>
+              </w:drawing>
+            </w:r>
+          </w:p>
+          <w:p>
+            <w:pPr>
+              <w:spacing w:after="0"/>
+              <w:jc w:val="center"/>
+            </w:pPr>
+            <w:r>
+              <w:rPr>
+                <w:b w:val="0"/>
+                <w:i/>
+                <w:color w:val="556670"/>
+                <w:sz w:val="14"/>
+              </w:rPr>
+              <w:t>At 390 px the pair stacks and the photograph widens.</w:t>
+            </w:r>
+          </w:p>
+        </w:tc>
+        <w:tc>
+          <w:tcPr>
+            <w:tcW w:type="dxa" w:w="4729"/>
+            <w:tcMar>
+              <w:top w:w="60" w:type="dxa"/>
+              <w:start w:w="60" w:type="dxa"/>
+              <w:bottom w:w="60" w:type="dxa"/>
+              <w:end w:w="60" w:type="dxa"/>
+            </w:tcMar>
+          </w:tcPr>
+          <w:p>
+            <w:pPr>
+              <w:spacing w:after="20"/>
+              <w:jc w:val="center"/>
+            </w:pPr>
+            <w:r>
+              <w:drawing>
+                <wp:inline xmlns:a="http://schemas.openxmlformats.org/drawingml/2006/main" xmlns:pic="http://schemas.openxmlformats.org/drawingml/2006/picture">
+                  <wp:extent cx="2148840" cy="1683909"/>
+                  <wp:docPr id="5" name="Picture 5"/>
+                  <wp:cNvGraphicFramePr>
+                    <a:graphicFrameLocks noChangeAspect="1"/>
+                  </wp:cNvGraphicFramePr>
+                  <a:graphic>
+                    <a:graphicData uri="http://schemas.openxmlformats.org/drawingml/2006/picture">
+                      <pic:pic>
+                        <pic:nvPicPr>
+                          <pic:cNvPr id="0" name="detail-reviews-en-40681.jpg"/>
+                          <pic:cNvPicPr/>
+                        </pic:nvPicPr>
+                        <pic:blipFill>
+                          <a:blip r:embed="rId17"/>
+                          <a:stretch>
+                            <a:fillRect/>
+                          </a:stretch>
+                        </pic:blipFill>
+                        <pic:spPr>
+                          <a:xfrm>
+                            <a:off x="0" y="0"/>
+                            <a:ext cx="2148840" cy="1683909"/>
+                          </a:xfrm>
+                          <a:prstGeom prst="rect"/>
+                        </pic:spPr>
+                      </pic:pic>
+                    </a:graphicData>
+                  </a:graphic>
+                </wp:inline>
+              </w:drawing>
+            </w:r>
+          </w:p>
+          <w:p>
+            <w:pPr>
+              <w:spacing w:after="0"/>
+              <w:jc w:val="center"/>
+            </w:pPr>
+            <w:r>
+              <w:rPr>
+                <w:b w:val="0"/>
+                <w:i/>
+                <w:color w:val="556670"/>
+                <w:sz w:val="14"/>
+              </w:rPr>
+              <w:t>What Guests Say — the typographic rating band.</w:t>
+            </w:r>
+          </w:p>
+        </w:tc>
+      </w:tr>
+    </w:tbl>
+    <w:p>
+      <w:pPr>
+        <w:spacing w:after="40"/>
+      </w:pPr>
+    </w:p>
+    <w:p>
+      <w:pPr>
+        <w:spacing w:before="240" w:after="100"/>
+      </w:pPr>
+      <w:r>
+        <w:rPr>
+          <w:b/>
+          <w:i w:val="0"/>
+          <w:color w:val="0F2334"/>
+          <w:sz w:val="23"/>
+        </w:rPr>
+        <w:t>Home — desktop</w:t>
+      </w:r>
+    </w:p>
+    <w:tbl>
+      <w:tblPr>
+        <w:tblStyle w:val="TableGrid"/>
+        <w:tblW w:type="auto" w:w="0"/>
+        <w:jc w:val="center"/>
+        <w:tblLook w:firstColumn="1" w:firstRow="1" w:lastColumn="0" w:lastRow="0" w:noHBand="0" w:noVBand="1" w:val="04A0"/>
+        <w:tblBorders>
+          <w:top w:val="none" w:sz="0" w:space="0"/>
+          <w:left w:val="none" w:sz="0" w:space="0"/>
+          <w:bottom w:val="none" w:sz="0" w:space="0"/>
+          <w:right w:val="none" w:sz="0" w:space="0"/>
+          <w:insideH w:val="none" w:sz="0" w:space="0"/>
+          <w:insideV w:val="none" w:sz="0" w:space="0"/>
+        </w:tblBorders>
+      </w:tblPr>
+      <w:tblGrid>
+        <w:gridCol w:w="3153"/>
+        <w:gridCol w:w="3153"/>
+        <w:gridCol w:w="3153"/>
+      </w:tblGrid>
+      <w:tr>
+        <w:tc>
+          <w:tcPr>
+            <w:tcW w:type="dxa" w:w="3153"/>
+            <w:tcMar>
+              <w:top w:w="60" w:type="dxa"/>
+              <w:start w:w="60" w:type="dxa"/>
+              <w:bottom w:w="60" w:type="dxa"/>
+              <w:end w:w="60" w:type="dxa"/>
+            </w:tcMar>
+          </w:tcPr>
+          <w:p>
+            <w:pPr>
+              <w:spacing w:after="20"/>
+              <w:jc w:val="center"/>
+            </w:pPr>
+            <w:r>
+              <w:drawing>
+                <wp:inline xmlns:a="http://schemas.openxmlformats.org/drawingml/2006/main" xmlns:pic="http://schemas.openxmlformats.org/drawingml/2006/picture">
+                  <wp:extent cx="2103120" cy="10735472"/>
+                  <wp:docPr id="6" name="Picture 6"/>
+                  <wp:cNvGraphicFramePr>
+                    <a:graphicFrameLocks noChangeAspect="1"/>
+                  </wp:cNvGraphicFramePr>
+                  <a:graphic>
+                    <a:graphicData uri="http://schemas.openxmlformats.org/drawingml/2006/picture">
+                      <pic:pic>
+                        <pic:nvPicPr>
+                          <pic:cNvPr id="0" name="desktop-en-4571706.jpg"/>
+                          <pic:cNvPicPr/>
+                        </pic:nvPicPr>
+                        <pic:blipFill>
+                          <a:blip r:embed="rId18"/>
+                          <a:stretch>
+                            <a:fillRect/>
+                          </a:stretch>
+                        </pic:blipFill>
+                        <pic:spPr>
+                          <a:xfrm>
+                            <a:off x="0" y="0"/>
+                            <a:ext cx="2103120" cy="10735472"/>
+                          </a:xfrm>
+                          <a:prstGeom prst="rect"/>
+                        </pic:spPr>
+                      </pic:pic>
+                    </a:graphicData>
+                  </a:graphic>
+                </wp:inline>
+              </w:drawing>
+            </w:r>
+          </w:p>
+          <w:p>
+            <w:pPr>
+              <w:spacing w:after="0"/>
+              <w:jc w:val="center"/>
+            </w:pPr>
+            <w:r>
+              <w:rPr>
+                <w:b w:val="0"/>
+                <w:i/>
+                <w:color w:val="556670"/>
+                <w:sz w:val="14"/>
+              </w:rPr>
+              <w:t>Full homepage, English — 1440 px.</w:t>
+            </w:r>
+          </w:p>
+        </w:tc>
+        <w:tc>
+          <w:tcPr>
+            <w:tcW w:type="dxa" w:w="3153"/>
+            <w:tcMar>
+              <w:top w:w="60" w:type="dxa"/>
+              <w:start w:w="60" w:type="dxa"/>
+              <w:bottom w:w="60" w:type="dxa"/>
+              <w:end w:w="60" w:type="dxa"/>
+            </w:tcMar>
+          </w:tcPr>
+          <w:p>
+            <w:pPr>
+              <w:spacing w:after="20"/>
+              <w:jc w:val="center"/>
+            </w:pPr>
+            <w:r>
+              <w:drawing>
+                <wp:inline xmlns:a="http://schemas.openxmlformats.org/drawingml/2006/main" xmlns:pic="http://schemas.openxmlformats.org/drawingml/2006/picture">
+                  <wp:extent cx="2103120" cy="10861659"/>
+                  <wp:docPr id="7" name="Picture 7"/>
+                  <wp:cNvGraphicFramePr>
+                    <a:graphicFrameLocks noChangeAspect="1"/>
+                  </wp:cNvGraphicFramePr>
+                  <a:graphic>
+                    <a:graphicData uri="http://schemas.openxmlformats.org/drawingml/2006/picture">
+                      <pic:pic>
+                        <pic:nvPicPr>
+                          <pic:cNvPr id="0" name="desktop-fr-4974213.jpg"/>
+                          <pic:cNvPicPr/>
+                        </pic:nvPicPr>
+                        <pic:blipFill>
+                          <a:blip r:embed="rId19"/>
+                          <a:stretch>
+                            <a:fillRect/>
+                          </a:stretch>
+                        </pic:blipFill>
+                        <pic:spPr>
+                          <a:xfrm>
+                            <a:off x="0" y="0"/>
+                            <a:ext cx="2103120" cy="10861659"/>
+                          </a:xfrm>
+                          <a:prstGeom prst="rect"/>
+                        </pic:spPr>
+                      </pic:pic>
+                    </a:graphicData>
+                  </a:graphic>
+                </wp:inline>
+              </w:drawing>
+            </w:r>
+          </w:p>
+          <w:p>
+            <w:pPr>
+              <w:spacing w:after="0"/>
+              <w:jc w:val="center"/>
+            </w:pPr>
+            <w:r>
+              <w:rPr>
+                <w:b w:val="0"/>
+                <w:i/>
+                <w:color w:val="556670"/>
+                <w:sz w:val="14"/>
+              </w:rPr>
+              <w:t>Full homepage, French — 1440 px.</w:t>
+            </w:r>
+          </w:p>
+        </w:tc>
+        <w:tc>
+          <w:tcPr>
+            <w:tcW w:type="dxa" w:w="3153"/>
+            <w:tcMar>
+              <w:top w:w="60" w:type="dxa"/>
+              <w:start w:w="60" w:type="dxa"/>
+              <w:bottom w:w="60" w:type="dxa"/>
+              <w:end w:w="60" w:type="dxa"/>
+            </w:tcMar>
+          </w:tcPr>
+          <w:p>
+            <w:pPr>
+              <w:spacing w:after="20"/>
+              <w:jc w:val="center"/>
+            </w:pPr>
+            <w:r>
+              <w:drawing>
+                <wp:inline xmlns:a="http://schemas.openxmlformats.org/drawingml/2006/main" xmlns:pic="http://schemas.openxmlformats.org/drawingml/2006/picture">
+                  <wp:extent cx="2103120" cy="10748855"/>
+                  <wp:docPr id="8" name="Picture 8"/>
+                  <wp:cNvGraphicFramePr>
+                    <a:graphicFrameLocks noChangeAspect="1"/>
+                  </wp:cNvGraphicFramePr>
+                  <a:graphic>
+                    <a:graphicData uri="http://schemas.openxmlformats.org/drawingml/2006/picture">
+                      <pic:pic>
+                        <pic:nvPicPr>
+                          <pic:cNvPr id="0" name="desktop-ar-4626631.jpg"/>
+                          <pic:cNvPicPr/>
+                        </pic:nvPicPr>
+                        <pic:blipFill>
+                          <a:blip r:embed="rId20"/>
+                          <a:stretch>
+                            <a:fillRect/>
+                          </a:stretch>
+                        </pic:blipFill>
+                        <pic:spPr>
+                          <a:xfrm>
+                            <a:off x="0" y="0"/>
+                            <a:ext cx="2103120" cy="10748855"/>
+                          </a:xfrm>
+                          <a:prstGeom prst="rect"/>
+                        </pic:spPr>
+                      </pic:pic>
+                    </a:graphicData>
+                  </a:graphic>
+                </wp:inline>
+              </w:drawing>
+            </w:r>
+          </w:p>
+          <w:p>
+            <w:pPr>
+              <w:spacing w:after="0"/>
+              <w:jc w:val="center"/>
+            </w:pPr>
+            <w:r>
+              <w:rPr>
+                <w:b w:val="0"/>
+                <w:i/>
+                <w:color w:val="556670"/>
+                <w:sz w:val="14"/>
+              </w:rPr>
+              <w:t>Full homepage, Arabic RTL — 1440 px.</w:t>
+            </w:r>
+          </w:p>
+        </w:tc>
+      </w:tr>
+    </w:tbl>
+    <w:p>
+      <w:pPr>
+        <w:spacing w:after="40"/>
+      </w:pPr>
+    </w:p>
+    <w:p>
+      <w:pPr>
+        <w:spacing w:before="240" w:after="100"/>
+      </w:pPr>
+      <w:r>
+        <w:rPr>
+          <w:b/>
+          <w:i w:val="0"/>
+          <w:color w:val="0F2334"/>
+          <w:sz w:val="23"/>
+        </w:rPr>
+        <w:t>Interior pages — desktop</w:t>
+      </w:r>
+    </w:p>
+    <w:tbl>
+      <w:tblPr>
+        <w:tblStyle w:val="TableGrid"/>
+        <w:tblW w:type="auto" w:w="0"/>
+        <w:jc w:val="center"/>
+        <w:tblLook w:firstColumn="1" w:firstRow="1" w:lastColumn="0" w:lastRow="0" w:noHBand="0" w:noVBand="1" w:val="04A0"/>
+        <w:tblBorders>
+          <w:top w:val="none" w:sz="0" w:space="0"/>
+          <w:left w:val="none" w:sz="0" w:space="0"/>
+          <w:bottom w:val="none" w:sz="0" w:space="0"/>
+          <w:right w:val="none" w:sz="0" w:space="0"/>
+          <w:insideH w:val="none" w:sz="0" w:space="0"/>
+          <w:insideV w:val="none" w:sz="0" w:space="0"/>
+        </w:tblBorders>
+      </w:tblPr>
+      <w:tblGrid>
+        <w:gridCol w:w="3153"/>
+        <w:gridCol w:w="3153"/>
+        <w:gridCol w:w="3153"/>
+      </w:tblGrid>
+      <w:tr>
+        <w:tc>
+          <w:tcPr>
+            <w:tcW w:type="dxa" w:w="3153"/>
+            <w:tcMar>
+              <w:top w:w="60" w:type="dxa"/>
+              <w:start w:w="60" w:type="dxa"/>
+              <w:bottom w:w="60" w:type="dxa"/>
+              <w:end w:w="60" w:type="dxa"/>
+            </w:tcMar>
+          </w:tcPr>
+          <w:p>
+            <w:pPr>
+              <w:spacing w:after="20"/>
+              <w:jc w:val="center"/>
+            </w:pPr>
+            <w:r>
+              <w:drawing>
+                <wp:inline xmlns:a="http://schemas.openxmlformats.org/drawingml/2006/main" xmlns:pic="http://schemas.openxmlformats.org/drawingml/2006/picture">
+                  <wp:extent cx="2103120" cy="2820093"/>
+                  <wp:docPr id="9" name="Picture 9"/>
+                  <wp:cNvGraphicFramePr>
+                    <a:graphicFrameLocks noChangeAspect="1"/>
+                  </wp:cNvGraphicFramePr>
+                  <a:graphic>
+                    <a:graphicData uri="http://schemas.openxmlformats.org/drawingml/2006/picture">
+                      <pic:pic>
+                        <pic:nvPicPr>
+                          <pic:cNvPr id="0" name="desktop-en-menu-461768.jpg"/>
+                          <pic:cNvPicPr/>
+                        </pic:nvPicPr>
+                        <pic:blipFill>
+                          <a:blip r:embed="rId21"/>
+                          <a:stretch>
+                            <a:fillRect/>
+                          </a:stretch>
+                        </pic:blipFill>
+                        <pic:spPr>
+                          <a:xfrm>
+                            <a:off x="0" y="0"/>
+                            <a:ext cx="2103120" cy="2820093"/>
+                          </a:xfrm>
+                          <a:prstGeom prst="rect"/>
+                        </pic:spPr>
+                      </pic:pic>
+                    </a:graphicData>
+                  </a:graphic>
+                </wp:inline>
+              </w:drawing>
+            </w:r>
+          </w:p>
+          <w:p>
+            <w:pPr>
+              <w:spacing w:after="0"/>
+              <w:jc w:val="center"/>
+            </w:pPr>
+            <w:r>
+              <w:rPr>
+                <w:b w:val="0"/>
+                <w:i/>
+                <w:color w:val="556670"/>
+                <w:sz w:val="14"/>
+              </w:rPr>
+              <w:t>Menu — English, desktop.</w:t>
+            </w:r>
+          </w:p>
+        </w:tc>
+        <w:tc>
+          <w:tcPr>
+            <w:tcW w:type="dxa" w:w="3153"/>
+            <w:tcMar>
+              <w:top w:w="60" w:type="dxa"/>
+              <w:start w:w="60" w:type="dxa"/>
+              <w:bottom w:w="60" w:type="dxa"/>
+              <w:end w:w="60" w:type="dxa"/>
+            </w:tcMar>
+          </w:tcPr>
+          <w:p>
+            <w:pPr>
+              <w:spacing w:after="20"/>
+              <w:jc w:val="center"/>
+            </w:pPr>
+            <w:r>
+              <w:drawing>
+                <wp:inline xmlns:a="http://schemas.openxmlformats.org/drawingml/2006/main" xmlns:pic="http://schemas.openxmlformats.org/drawingml/2006/picture">
+                  <wp:extent cx="2103120" cy="3139385"/>
+                  <wp:docPr id="10" name="Picture 10"/>
+                  <wp:cNvGraphicFramePr>
+                    <a:graphicFrameLocks noChangeAspect="1"/>
+                  </wp:cNvGraphicFramePr>
+                  <a:graphic>
+                    <a:graphicData uri="http://schemas.openxmlformats.org/drawingml/2006/picture">
+                      <pic:pic>
+                        <pic:nvPicPr>
+                          <pic:cNvPr id="0" name="desktop-en-about-402575.jpg"/>
+                          <pic:cNvPicPr/>
+                        </pic:nvPicPr>
+                        <pic:blipFill>
+                          <a:blip r:embed="rId22"/>
+                          <a:stretch>
+                            <a:fillRect/>
+                          </a:stretch>
+                        </pic:blipFill>
+                        <pic:spPr>
+                          <a:xfrm>
+                            <a:off x="0" y="0"/>
+                            <a:ext cx="2103120" cy="3139385"/>
+                          </a:xfrm>
+                          <a:prstGeom prst="rect"/>
+                        </pic:spPr>
+                      </pic:pic>
+                    </a:graphicData>
+                  </a:graphic>
+                </wp:inline>
+              </w:drawing>
+            </w:r>
+          </w:p>
+          <w:p>
+            <w:pPr>
+              <w:spacing w:after="0"/>
+              <w:jc w:val="center"/>
+            </w:pPr>
+            <w:r>
+              <w:rPr>
+                <w:b w:val="0"/>
+                <w:i/>
+                <w:color w:val="556670"/>
+                <w:sz w:val="14"/>
+              </w:rPr>
+              <w:t>About — English, desktop.</w:t>
+            </w:r>
+          </w:p>
+        </w:tc>
+        <w:tc>
+          <w:tcPr>
+            <w:tcW w:type="dxa" w:w="3153"/>
+            <w:tcMar>
+              <w:top w:w="60" w:type="dxa"/>
+              <w:start w:w="60" w:type="dxa"/>
+              <w:bottom w:w="60" w:type="dxa"/>
+              <w:end w:w="60" w:type="dxa"/>
+            </w:tcMar>
+          </w:tcPr>
+          <w:p>
+            <w:pPr>
+              <w:spacing w:after="20"/>
+              <w:jc w:val="center"/>
+            </w:pPr>
+            <w:r>
+              <w:drawing>
+                <wp:inline xmlns:a="http://schemas.openxmlformats.org/drawingml/2006/main" xmlns:pic="http://schemas.openxmlformats.org/drawingml/2006/picture">
+                  <wp:extent cx="2103120" cy="3410878"/>
+                  <wp:docPr id="11" name="Picture 11"/>
+                  <wp:cNvGraphicFramePr>
+                    <a:graphicFrameLocks noChangeAspect="1"/>
+                  </wp:cNvGraphicFramePr>
+                  <a:graphic>
+                    <a:graphicData uri="http://schemas.openxmlformats.org/drawingml/2006/picture">
+                      <pic:pic>
+                        <pic:nvPicPr>
+                          <pic:cNvPr id="0" name="desktop-en-gallery-1708256.jpg"/>
+                          <pic:cNvPicPr/>
+                        </pic:nvPicPr>
+                        <pic:blipFill>
+                          <a:blip r:embed="rId23"/>
+                          <a:stretch>
+                            <a:fillRect/>
+                          </a:stretch>
+                        </pic:blipFill>
+                        <pic:spPr>
+                          <a:xfrm>
+                            <a:off x="0" y="0"/>
+                            <a:ext cx="2103120" cy="3410878"/>
+                          </a:xfrm>
+                          <a:prstGeom prst="rect"/>
+                        </pic:spPr>
+                      </pic:pic>
+                    </a:graphicData>
+                  </a:graphic>
+                </wp:inline>
+              </w:drawing>
+            </w:r>
+          </w:p>
+          <w:p>
+            <w:pPr>
+              <w:spacing w:after="0"/>
+              <w:jc w:val="center"/>
+            </w:pPr>
+            <w:r>
+              <w:rPr>
+                <w:b w:val="0"/>
+                <w:i/>
+                <w:color w:val="556670"/>
+                <w:sz w:val="14"/>
+              </w:rPr>
+              <w:t>Gallery — English, desktop.</w:t>
+            </w:r>
+          </w:p>
+        </w:tc>
+      </w:tr>
+      <w:tr>
+        <w:tc>
+          <w:tcPr>
+            <w:tcW w:type="dxa" w:w="3153"/>
+            <w:tcMar>
+              <w:top w:w="60" w:type="dxa"/>
+              <w:start w:w="60" w:type="dxa"/>
+              <w:bottom w:w="60" w:type="dxa"/>
+              <w:end w:w="60" w:type="dxa"/>
+            </w:tcMar>
+          </w:tcPr>
+          <w:p>
+            <w:pPr>
+              <w:spacing w:after="20"/>
+              <w:jc w:val="center"/>
+            </w:pPr>
+            <w:r>
+              <w:drawing>
+                <wp:inline xmlns:a="http://schemas.openxmlformats.org/drawingml/2006/main" xmlns:pic="http://schemas.openxmlformats.org/drawingml/2006/picture">
+                  <wp:extent cx="2103120" cy="3169975"/>
+                  <wp:docPr id="12" name="Picture 12"/>
+                  <wp:cNvGraphicFramePr>
+                    <a:graphicFrameLocks noChangeAspect="1"/>
+                  </wp:cNvGraphicFramePr>
+                  <a:graphic>
+                    <a:graphicData uri="http://schemas.openxmlformats.org/drawingml/2006/picture">
+                      <pic:pic>
+                        <pic:nvPicPr>
+                          <pic:cNvPr id="0" name="desktop-en-location-415829.jpg"/>
+                          <pic:cNvPicPr/>
+                        </pic:nvPicPr>
+                        <pic:blipFill>
+                          <a:blip r:embed="rId24"/>
+                          <a:stretch>
+                            <a:fillRect/>
+                          </a:stretch>
+                        </pic:blipFill>
+                        <pic:spPr>
+                          <a:xfrm>
+                            <a:off x="0" y="0"/>
+                            <a:ext cx="2103120" cy="3169975"/>
+                          </a:xfrm>
+                          <a:prstGeom prst="rect"/>
+                        </pic:spPr>
+                      </pic:pic>
+                    </a:graphicData>
+                  </a:graphic>
+                </wp:inline>
+              </w:drawing>
+            </w:r>
+          </w:p>
+          <w:p>
+            <w:pPr>
+              <w:spacing w:after="0"/>
+              <w:jc w:val="center"/>
+            </w:pPr>
+            <w:r>
+              <w:rPr>
+                <w:b w:val="0"/>
+                <w:i/>
+                <w:color w:val="556670"/>
+                <w:sz w:val="14"/>
+              </w:rPr>
+              <w:t>Location — map embed, English, desktop.</w:t>
+            </w:r>
+          </w:p>
+        </w:tc>
+        <w:tc>
+          <w:tcPr>
+            <w:tcW w:type="dxa" w:w="3153"/>
+            <w:tcMar>
+              <w:top w:w="60" w:type="dxa"/>
+              <w:start w:w="60" w:type="dxa"/>
+              <w:bottom w:w="60" w:type="dxa"/>
+              <w:end w:w="60" w:type="dxa"/>
+            </w:tcMar>
+          </w:tcPr>
+          <w:p>
+            <w:pPr>
+              <w:spacing w:after="20"/>
+              <w:jc w:val="center"/>
+            </w:pPr>
+            <w:r>
+              <w:drawing>
+                <wp:inline xmlns:a="http://schemas.openxmlformats.org/drawingml/2006/main" xmlns:pic="http://schemas.openxmlformats.org/drawingml/2006/picture">
+                  <wp:extent cx="2103120" cy="2793326"/>
+                  <wp:docPr id="13" name="Picture 13"/>
+                  <wp:cNvGraphicFramePr>
+                    <a:graphicFrameLocks noChangeAspect="1"/>
+                  </wp:cNvGraphicFramePr>
+                  <a:graphic>
+                    <a:graphicData uri="http://schemas.openxmlformats.org/drawingml/2006/picture">
+                      <pic:pic>
+                        <pic:nvPicPr>
+                          <pic:cNvPr id="0" name="desktop-en-reviews-534811.jpg"/>
+                          <pic:cNvPicPr/>
+                        </pic:nvPicPr>
+                        <pic:blipFill>
+                          <a:blip r:embed="rId25"/>
+                          <a:stretch>
+                            <a:fillRect/>
+                          </a:stretch>
+                        </pic:blipFill>
+                        <pic:spPr>
+                          <a:xfrm>
+                            <a:off x="0" y="0"/>
+                            <a:ext cx="2103120" cy="2793326"/>
+                          </a:xfrm>
+                          <a:prstGeom prst="rect"/>
+                        </pic:spPr>
+                      </pic:pic>
+                    </a:graphicData>
+                  </a:graphic>
+                </wp:inline>
+              </w:drawing>
+            </w:r>
+          </w:p>
+          <w:p>
+            <w:pPr>
+              <w:spacing w:after="0"/>
+              <w:jc w:val="center"/>
+            </w:pPr>
+            <w:r>
+              <w:rPr>
+                <w:b w:val="0"/>
+                <w:i/>
+                <w:color w:val="556670"/>
+                <w:sz w:val="14"/>
+              </w:rPr>
+              <w:t>What guests say — page, English, desktop.</w:t>
+            </w:r>
+          </w:p>
+        </w:tc>
+        <w:tc>
+          <w:tcPr>
+            <w:tcW w:type="dxa" w:w="3153"/>
+            <w:tcMar>
+              <w:top w:w="60" w:type="dxa"/>
+              <w:start w:w="60" w:type="dxa"/>
+              <w:bottom w:w="60" w:type="dxa"/>
+              <w:end w:w="60" w:type="dxa"/>
+            </w:tcMar>
+          </w:tcPr>
+          <w:p>
+            <w:pPr>
+              <w:spacing w:after="20"/>
+              <w:jc w:val="center"/>
+            </w:pPr>
+            <w:r>
+              <w:drawing>
+                <wp:inline xmlns:a="http://schemas.openxmlformats.org/drawingml/2006/main" xmlns:pic="http://schemas.openxmlformats.org/drawingml/2006/picture">
+                  <wp:extent cx="2103120" cy="2632724"/>
+                  <wp:docPr id="14" name="Picture 14"/>
+                  <wp:cNvGraphicFramePr>
+                    <a:graphicFrameLocks noChangeAspect="1"/>
+                  </wp:cNvGraphicFramePr>
+                  <a:graphic>
+                    <a:graphicData uri="http://schemas.openxmlformats.org/drawingml/2006/picture">
+                      <pic:pic>
+                        <pic:nvPicPr>
+                          <pic:cNvPr id="0" name="desktop-en-contact-121692.jpg"/>
+                          <pic:cNvPicPr/>
+                        </pic:nvPicPr>
+                        <pic:blipFill>
+                          <a:blip r:embed="rId26"/>
+                          <a:stretch>
+                            <a:fillRect/>
+                          </a:stretch>
+                        </pic:blipFill>
+                        <pic:spPr>
+                          <a:xfrm>
+                            <a:off x="0" y="0"/>
+                            <a:ext cx="2103120" cy="2632724"/>
+                          </a:xfrm>
+                          <a:prstGeom prst="rect"/>
+                        </pic:spPr>
+                      </pic:pic>
+                    </a:graphicData>
+                  </a:graphic>
+                </wp:inline>
+              </w:drawing>
+            </w:r>
+          </w:p>
+          <w:p>
+            <w:pPr>
+              <w:spacing w:after="0"/>
+              <w:jc w:val="center"/>
+            </w:pPr>
+            <w:r>
+              <w:rPr>
+                <w:b w:val="0"/>
+                <w:i/>
+                <w:color w:val="556670"/>
+                <w:sz w:val="14"/>
+              </w:rPr>
+              <w:t>Contact — English, desktop.</w:t>
+            </w:r>
+          </w:p>
+        </w:tc>
+      </w:tr>
+    </w:tbl>
+    <w:p>
+      <w:pPr>
+        <w:spacing w:after="40"/>
+      </w:pPr>
+    </w:p>
+    <w:p>
+      <w:pPr>
+        <w:spacing w:before="240" w:after="100"/>
+      </w:pPr>
+      <w:r>
+        <w:rPr>
+          <w:b/>
+          <w:i w:val="0"/>
+          <w:color w:val="0F2334"/>
+          <w:sz w:val="23"/>
+        </w:rPr>
+        <w:t>Home — phone</w:t>
+      </w:r>
+    </w:p>
+    <w:tbl>
+      <w:tblPr>
+        <w:tblStyle w:val="TableGrid"/>
+        <w:tblW w:type="auto" w:w="0"/>
+        <w:jc w:val="center"/>
+        <w:tblLook w:firstColumn="1" w:firstRow="1" w:lastColumn="0" w:lastRow="0" w:noHBand="0" w:noVBand="1" w:val="04A0"/>
+        <w:tblBorders>
+          <w:top w:val="none" w:sz="0" w:space="0"/>
+          <w:left w:val="none" w:sz="0" w:space="0"/>
+          <w:bottom w:val="none" w:sz="0" w:space="0"/>
+          <w:right w:val="none" w:sz="0" w:space="0"/>
+          <w:insideH w:val="none" w:sz="0" w:space="0"/>
+          <w:insideV w:val="none" w:sz="0" w:space="0"/>
+        </w:tblBorders>
+      </w:tblPr>
+      <w:tblGrid>
+        <w:gridCol w:w="3153"/>
+        <w:gridCol w:w="3153"/>
+        <w:gridCol w:w="3153"/>
+      </w:tblGrid>
+      <w:tr>
+        <w:tc>
+          <w:tcPr>
+            <w:tcW w:type="dxa" w:w="3153"/>
+            <w:tcMar>
+              <w:top w:w="60" w:type="dxa"/>
+              <w:start w:w="60" w:type="dxa"/>
+              <w:bottom w:w="60" w:type="dxa"/>
+              <w:end w:w="60" w:type="dxa"/>
+            </w:tcMar>
+          </w:tcPr>
+          <w:p>
+            <w:pPr>
+              <w:spacing w:after="20"/>
+              <w:jc w:val="center"/>
+            </w:pPr>
+            <w:r>
+              <w:drawing>
+                <wp:inline xmlns:a="http://schemas.openxmlformats.org/drawingml/2006/main" xmlns:pic="http://schemas.openxmlformats.org/drawingml/2006/picture">
+                  <wp:extent cx="1691640" cy="41189265"/>
+                  <wp:docPr id="15" name="Picture 15"/>
+                  <wp:cNvGraphicFramePr>
+                    <a:graphicFrameLocks noChangeAspect="1"/>
+                  </wp:cNvGraphicFramePr>
+                  <a:graphic>
+                    <a:graphicData uri="http://schemas.openxmlformats.org/drawingml/2006/picture">
+                      <pic:pic>
+                        <pic:nvPicPr>
+                          <pic:cNvPr id="0" name="phone-en-1484621.jpg"/>
+                          <pic:cNvPicPr/>
+                        </pic:nvPicPr>
+                        <pic:blipFill>
+                          <a:blip r:embed="rId27"/>
+                          <a:stretch>
+                            <a:fillRect/>
+                          </a:stretch>
+                        </pic:blipFill>
+                        <pic:spPr>
+                          <a:xfrm>
+                            <a:off x="0" y="0"/>
+                            <a:ext cx="1691640" cy="41189265"/>
+                          </a:xfrm>
+                          <a:prstGeom prst="rect"/>
+                        </pic:spPr>
+                      </pic:pic>
+                    </a:graphicData>
+                  </a:graphic>
+                </wp:inline>
+              </w:drawing>
+            </w:r>
+          </w:p>
+          <w:p>
+            <w:pPr>
+              <w:spacing w:after="0"/>
+              <w:jc w:val="center"/>
+            </w:pPr>
+            <w:r>
+              <w:rPr>
+                <w:b w:val="0"/>
+                <w:i/>
+                <w:color w:val="556670"/>
+                <w:sz w:val="14"/>
+              </w:rPr>
+              <w:t>Homepage, English — 390 px.</w:t>
+            </w:r>
+          </w:p>
+        </w:tc>
+        <w:tc>
+          <w:tcPr>
+            <w:tcW w:type="dxa" w:w="3153"/>
+            <w:tcMar>
+              <w:top w:w="60" w:type="dxa"/>
+              <w:start w:w="60" w:type="dxa"/>
+              <w:bottom w:w="60" w:type="dxa"/>
+              <w:end w:w="60" w:type="dxa"/>
+            </w:tcMar>
+          </w:tcPr>
+          <w:p>
+            <w:pPr>
+              <w:spacing w:after="20"/>
+              <w:jc w:val="center"/>
+            </w:pPr>
+            <w:r>
+              <w:drawing>
+                <wp:inline xmlns:a="http://schemas.openxmlformats.org/drawingml/2006/main" xmlns:pic="http://schemas.openxmlformats.org/drawingml/2006/picture">
+                  <wp:extent cx="1691640" cy="41640369"/>
+                  <wp:docPr id="16" name="Picture 16"/>
+                  <wp:cNvGraphicFramePr>
+                    <a:graphicFrameLocks noChangeAspect="1"/>
+                  </wp:cNvGraphicFramePr>
+                  <a:graphic>
+                    <a:graphicData uri="http://schemas.openxmlformats.org/drawingml/2006/picture">
+                      <pic:pic>
+                        <pic:nvPicPr>
+                          <pic:cNvPr id="0" name="phone-fr-1503138.jpg"/>
+                          <pic:cNvPicPr/>
+                        </pic:nvPicPr>
+                        <pic:blipFill>
+                          <a:blip r:embed="rId28"/>
+                          <a:stretch>
+                            <a:fillRect/>
+                          </a:stretch>
+                        </pic:blipFill>
+                        <pic:spPr>
+                          <a:xfrm>
+                            <a:off x="0" y="0"/>
+                            <a:ext cx="1691640" cy="41640369"/>
+                          </a:xfrm>
+                          <a:prstGeom prst="rect"/>
+                        </pic:spPr>
+                      </pic:pic>
+                    </a:graphicData>
+                  </a:graphic>
+                </wp:inline>
+              </w:drawing>
+            </w:r>
+          </w:p>
+          <w:p>
+            <w:pPr>
+              <w:spacing w:after="0"/>
+              <w:jc w:val="center"/>
+            </w:pPr>
+            <w:r>
+              <w:rPr>
+                <w:b w:val="0"/>
+                <w:i/>
+                <w:color w:val="556670"/>
+                <w:sz w:val="14"/>
+              </w:rPr>
+              <w:t>Homepage, French — 390 px.</w:t>
+            </w:r>
+          </w:p>
+        </w:tc>
+        <w:tc>
+          <w:tcPr>
+            <w:tcW w:type="dxa" w:w="3153"/>
+            <w:tcMar>
+              <w:top w:w="60" w:type="dxa"/>
+              <w:start w:w="60" w:type="dxa"/>
+              <w:bottom w:w="60" w:type="dxa"/>
+              <w:end w:w="60" w:type="dxa"/>
+            </w:tcMar>
+          </w:tcPr>
+          <w:p>
+            <w:pPr>
+              <w:spacing w:after="20"/>
+              <w:jc w:val="center"/>
+            </w:pPr>
+            <w:r>
+              <w:drawing>
+                <wp:inline xmlns:a="http://schemas.openxmlformats.org/drawingml/2006/main" xmlns:pic="http://schemas.openxmlformats.org/drawingml/2006/picture">
+                  <wp:extent cx="1691640" cy="40703461"/>
+                  <wp:docPr id="17" name="Picture 17"/>
+                  <wp:cNvGraphicFramePr>
+                    <a:graphicFrameLocks noChangeAspect="1"/>
+                  </wp:cNvGraphicFramePr>
+                  <a:graphic>
+                    <a:graphicData uri="http://schemas.openxmlformats.org/drawingml/2006/picture">
+                      <pic:pic>
+                        <pic:nvPicPr>
+                          <pic:cNvPr id="0" name="phone-ar-1530213.jpg"/>
+                          <pic:cNvPicPr/>
+                        </pic:nvPicPr>
+                        <pic:blipFill>
+                          <a:blip r:embed="rId29"/>
+                          <a:stretch>
+                            <a:fillRect/>
+                          </a:stretch>
+                        </pic:blipFill>
+                        <pic:spPr>
+                          <a:xfrm>
+                            <a:off x="0" y="0"/>
+                            <a:ext cx="1691640" cy="40703461"/>
+                          </a:xfrm>
+                          <a:prstGeom prst="rect"/>
+                        </pic:spPr>
+                      </pic:pic>
+                    </a:graphicData>
+                  </a:graphic>
+                </wp:inline>
+              </w:drawing>
+            </w:r>
+          </w:p>
+          <w:p>
+            <w:pPr>
+              <w:spacing w:after="0"/>
+              <w:jc w:val="center"/>
+            </w:pPr>
+            <w:r>
+              <w:rPr>
+                <w:b w:val="0"/>
+                <w:i/>
+                <w:color w:val="556670"/>
+                <w:sz w:val="14"/>
+              </w:rPr>
+              <w:t>Homepage, Arabic RTL — 390 px.</w:t>
+            </w:r>
+          </w:p>
+        </w:tc>
+      </w:tr>
+    </w:tbl>
+    <w:p>
+      <w:pPr>
+        <w:spacing w:after="40"/>
+      </w:pPr>
+    </w:p>
+    <w:p>
+      <w:pPr>
+        <w:spacing w:before="240" w:after="100"/>
+      </w:pPr>
+      <w:r>
+        <w:rPr>
+          <w:b/>
+          <w:i w:val="0"/>
+          <w:color w:val="0F2334"/>
+          <w:sz w:val="23"/>
+        </w:rPr>
+        <w:t>Interior pages — phone</w:t>
+      </w:r>
+    </w:p>
+    <w:tbl>
+      <w:tblPr>
+        <w:tblStyle w:val="TableGrid"/>
+        <w:tblW w:type="auto" w:w="0"/>
+        <w:jc w:val="center"/>
+        <w:tblLook w:firstColumn="1" w:firstRow="1" w:lastColumn="0" w:lastRow="0" w:noHBand="0" w:noVBand="1" w:val="04A0"/>
+        <w:tblBorders>
+          <w:top w:val="none" w:sz="0" w:space="0"/>
+          <w:left w:val="none" w:sz="0" w:space="0"/>
+          <w:bottom w:val="none" w:sz="0" w:space="0"/>
+          <w:right w:val="none" w:sz="0" w:space="0"/>
+          <w:insideH w:val="none" w:sz="0" w:space="0"/>
+          <w:insideV w:val="none" w:sz="0" w:space="0"/>
+        </w:tblBorders>
+      </w:tblPr>
+      <w:tblGrid>
+        <w:gridCol w:w="3153"/>
+        <w:gridCol w:w="3153"/>
+        <w:gridCol w:w="3153"/>
+      </w:tblGrid>
+      <w:tr>
+        <w:tc>
+          <w:tcPr>
+            <w:tcW w:type="dxa" w:w="3153"/>
+            <w:tcMar>
+              <w:top w:w="60" w:type="dxa"/>
+              <w:start w:w="60" w:type="dxa"/>
+              <w:bottom w:w="60" w:type="dxa"/>
+              <w:end w:w="60" w:type="dxa"/>
+            </w:tcMar>
+          </w:tcPr>
+          <w:p>
+            <w:pPr>
+              <w:spacing w:after="20"/>
+              <w:jc w:val="center"/>
+            </w:pPr>
+            <w:r>
+              <w:drawing>
+                <wp:inline xmlns:a="http://schemas.openxmlformats.org/drawingml/2006/main" xmlns:pic="http://schemas.openxmlformats.org/drawingml/2006/picture">
+                  <wp:extent cx="1691640" cy="14604492"/>
+                  <wp:docPr id="18" name="Picture 18"/>
+                  <wp:cNvGraphicFramePr>
+                    <a:graphicFrameLocks noChangeAspect="1"/>
+                  </wp:cNvGraphicFramePr>
+                  <a:graphic>
+                    <a:graphicData uri="http://schemas.openxmlformats.org/drawingml/2006/picture">
+                      <pic:pic>
+                        <pic:nvPicPr>
+                          <pic:cNvPr id="0" name="phone-en-menu-331021.jpg"/>
+                          <pic:cNvPicPr/>
+                        </pic:nvPicPr>
+                        <pic:blipFill>
+                          <a:blip r:embed="rId30"/>
+                          <a:stretch>
+                            <a:fillRect/>
+                          </a:stretch>
+                        </pic:blipFill>
+                        <pic:spPr>
+                          <a:xfrm>
+                            <a:off x="0" y="0"/>
+                            <a:ext cx="1691640" cy="14604492"/>
+                          </a:xfrm>
+                          <a:prstGeom prst="rect"/>
+                        </pic:spPr>
+                      </pic:pic>
+                    </a:graphicData>
+                  </a:graphic>
+                </wp:inline>
+              </w:drawing>
+            </w:r>
+          </w:p>
+          <w:p>
+            <w:pPr>
+              <w:spacing w:after="0"/>
+              <w:jc w:val="center"/>
+            </w:pPr>
+            <w:r>
+              <w:rPr>
+                <w:b w:val="0"/>
+                <w:i/>
+                <w:color w:val="556670"/>
+                <w:sz w:val="14"/>
+              </w:rPr>
+              <w:t>Menu — English, phone.</w:t>
+            </w:r>
+          </w:p>
+        </w:tc>
+        <w:tc>
+          <w:tcPr>
+            <w:tcW w:type="dxa" w:w="3153"/>
+            <w:tcMar>
+              <w:top w:w="60" w:type="dxa"/>
+              <w:start w:w="60" w:type="dxa"/>
+              <w:bottom w:w="60" w:type="dxa"/>
+              <w:end w:w="60" w:type="dxa"/>
+            </w:tcMar>
+          </w:tcPr>
+          <w:p>
+            <w:pPr>
+              <w:spacing w:after="20"/>
+              <w:jc w:val="center"/>
+            </w:pPr>
+            <w:r>
+              <w:drawing>
+                <wp:inline xmlns:a="http://schemas.openxmlformats.org/drawingml/2006/main" xmlns:pic="http://schemas.openxmlformats.org/drawingml/2006/picture">
+                  <wp:extent cx="1691640" cy="16699523"/>
+                  <wp:docPr id="19" name="Picture 19"/>
+                  <wp:cNvGraphicFramePr>
+                    <a:graphicFrameLocks noChangeAspect="1"/>
+                  </wp:cNvGraphicFramePr>
+                  <a:graphic>
+                    <a:graphicData uri="http://schemas.openxmlformats.org/drawingml/2006/picture">
+                      <pic:pic>
+                        <pic:nvPicPr>
+                          <pic:cNvPr id="0" name="phone-en-about-271476.jpg"/>
+                          <pic:cNvPicPr/>
+                        </pic:nvPicPr>
+                        <pic:blipFill>
+                          <a:blip r:embed="rId31"/>
+                          <a:stretch>
+                            <a:fillRect/>
+                          </a:stretch>
+                        </pic:blipFill>
+                        <pic:spPr>
+                          <a:xfrm>
+                            <a:off x="0" y="0"/>
+                            <a:ext cx="1691640" cy="16699523"/>
+                          </a:xfrm>
+                          <a:prstGeom prst="rect"/>
+                        </pic:spPr>
+                      </pic:pic>
+                    </a:graphicData>
+                  </a:graphic>
+                </wp:inline>
+              </w:drawing>
+            </w:r>
+          </w:p>
+          <w:p>
+            <w:pPr>
+              <w:spacing w:after="0"/>
+              <w:jc w:val="center"/>
+            </w:pPr>
+            <w:r>
+              <w:rPr>
+                <w:b w:val="0"/>
+                <w:i/>
+                <w:color w:val="556670"/>
+                <w:sz w:val="14"/>
+              </w:rPr>
+              <w:t>About — English, phone.</w:t>
+            </w:r>
+          </w:p>
+        </w:tc>
+        <w:tc>
+          <w:tcPr>
+            <w:tcW w:type="dxa" w:w="3153"/>
+            <w:tcMar>
+              <w:top w:w="60" w:type="dxa"/>
+              <w:start w:w="60" w:type="dxa"/>
+              <w:bottom w:w="60" w:type="dxa"/>
+              <w:end w:w="60" w:type="dxa"/>
+            </w:tcMar>
+          </w:tcPr>
+          <w:p>
+            <w:pPr>
+              <w:spacing w:after="20"/>
+              <w:jc w:val="center"/>
+            </w:pPr>
+            <w:r>
+              <w:drawing>
+                <wp:inline xmlns:a="http://schemas.openxmlformats.org/drawingml/2006/main" xmlns:pic="http://schemas.openxmlformats.org/drawingml/2006/picture">
+                  <wp:extent cx="1691640" cy="31217264"/>
+                  <wp:docPr id="20" name="Picture 20"/>
+                  <wp:cNvGraphicFramePr>
+                    <a:graphicFrameLocks noChangeAspect="1"/>
+                  </wp:cNvGraphicFramePr>
+                  <a:graphic>
+                    <a:graphicData uri="http://schemas.openxmlformats.org/drawingml/2006/picture">
+                      <pic:pic>
+                        <pic:nvPicPr>
+                          <pic:cNvPr id="0" name="phone-en-gallery-1266901.jpg"/>
+                          <pic:cNvPicPr/>
+                        </pic:nvPicPr>
+                        <pic:blipFill>
+                          <a:blip r:embed="rId32"/>
+                          <a:stretch>
+                            <a:fillRect/>
+                          </a:stretch>
+                        </pic:blipFill>
+                        <pic:spPr>
+                          <a:xfrm>
+                            <a:off x="0" y="0"/>
+                            <a:ext cx="1691640" cy="31217264"/>
+                          </a:xfrm>
+                          <a:prstGeom prst="rect"/>
+                        </pic:spPr>
+                      </pic:pic>
+                    </a:graphicData>
+                  </a:graphic>
+                </wp:inline>
+              </w:drawing>
+            </w:r>
+          </w:p>
+          <w:p>
+            <w:pPr>
+              <w:spacing w:after="0"/>
+              <w:jc w:val="center"/>
+            </w:pPr>
+            <w:r>
+              <w:rPr>
+                <w:b w:val="0"/>
+                <w:i/>
+                <w:color w:val="556670"/>
+                <w:sz w:val="14"/>
+              </w:rPr>
+              <w:t>Gallery — English, phone.</w:t>
+            </w:r>
+          </w:p>
+        </w:tc>
+      </w:tr>
+      <w:tr>
+        <w:tc>
+          <w:tcPr>
+            <w:tcW w:type="dxa" w:w="3153"/>
+            <w:tcMar>
+              <w:top w:w="60" w:type="dxa"/>
+              <w:start w:w="60" w:type="dxa"/>
+              <w:bottom w:w="60" w:type="dxa"/>
+              <w:end w:w="60" w:type="dxa"/>
+            </w:tcMar>
+          </w:tcPr>
+          <w:p>
+            <w:pPr>
+              <w:spacing w:after="20"/>
+              <w:jc w:val="center"/>
+            </w:pPr>
+            <w:r>
+              <w:drawing>
+                <wp:inline xmlns:a="http://schemas.openxmlformats.org/drawingml/2006/main" xmlns:pic="http://schemas.openxmlformats.org/drawingml/2006/picture">
+                  <wp:extent cx="1691640" cy="14196763"/>
+                  <wp:docPr id="21" name="Picture 21"/>
+                  <wp:cNvGraphicFramePr>
+                    <a:graphicFrameLocks noChangeAspect="1"/>
+                  </wp:cNvGraphicFramePr>
+                  <a:graphic>
+                    <a:graphicData uri="http://schemas.openxmlformats.org/drawingml/2006/picture">
+                      <pic:pic>
+                        <pic:nvPicPr>
+                          <pic:cNvPr id="0" name="phone-en-location-256751.jpg"/>
+                          <pic:cNvPicPr/>
+                        </pic:nvPicPr>
+                        <pic:blipFill>
+                          <a:blip r:embed="rId33"/>
+                          <a:stretch>
+                            <a:fillRect/>
+                          </a:stretch>
+                        </pic:blipFill>
+                        <pic:spPr>
+                          <a:xfrm>
+                            <a:off x="0" y="0"/>
+                            <a:ext cx="1691640" cy="14196763"/>
+                          </a:xfrm>
+                          <a:prstGeom prst="rect"/>
+                        </pic:spPr>
+                      </pic:pic>
+                    </a:graphicData>
+                  </a:graphic>
+                </wp:inline>
+              </w:drawing>
+            </w:r>
+          </w:p>
+          <w:p>
+            <w:pPr>
+              <w:spacing w:after="0"/>
+              <w:jc w:val="center"/>
+            </w:pPr>
+            <w:r>
+              <w:rPr>
+                <w:b w:val="0"/>
+                <w:i/>
+                <w:color w:val="556670"/>
+                <w:sz w:val="14"/>
+              </w:rPr>
+              <w:t>Location — English, phone.</w:t>
+            </w:r>
+          </w:p>
+        </w:tc>
+        <w:tc>
+          <w:tcPr>
+            <w:tcW w:type="dxa" w:w="3153"/>
+            <w:tcMar>
+              <w:top w:w="60" w:type="dxa"/>
+              <w:start w:w="60" w:type="dxa"/>
+              <w:bottom w:w="60" w:type="dxa"/>
+              <w:end w:w="60" w:type="dxa"/>
+            </w:tcMar>
+          </w:tcPr>
+          <w:p>
+            <w:pPr>
+              <w:spacing w:after="20"/>
+              <w:jc w:val="center"/>
+            </w:pPr>
+            <w:r>
+              <w:drawing>
+                <wp:inline xmlns:a="http://schemas.openxmlformats.org/drawingml/2006/main" xmlns:pic="http://schemas.openxmlformats.org/drawingml/2006/picture">
+                  <wp:extent cx="1691640" cy="11902206"/>
+                  <wp:docPr id="22" name="Picture 22"/>
+                  <wp:cNvGraphicFramePr>
+                    <a:graphicFrameLocks noChangeAspect="1"/>
+                  </wp:cNvGraphicFramePr>
+                  <a:graphic>
+                    <a:graphicData uri="http://schemas.openxmlformats.org/drawingml/2006/picture">
+                      <pic:pic>
+                        <pic:nvPicPr>
+                          <pic:cNvPr id="0" name="phone-en-reviews-279803.jpg"/>
+                          <pic:cNvPicPr/>
+                        </pic:nvPicPr>
+                        <pic:blipFill>
+                          <a:blip r:embed="rId34"/>
+                          <a:stretch>
+                            <a:fillRect/>
+                          </a:stretch>
+                        </pic:blipFill>
+                        <pic:spPr>
+                          <a:xfrm>
+                            <a:off x="0" y="0"/>
+                            <a:ext cx="1691640" cy="11902206"/>
+                          </a:xfrm>
+                          <a:prstGeom prst="rect"/>
+                        </pic:spPr>
+                      </pic:pic>
+                    </a:graphicData>
+                  </a:graphic>
+                </wp:inline>
+              </w:drawing>
+            </w:r>
+          </w:p>
+          <w:p>
+            <w:pPr>
+              <w:spacing w:after="0"/>
+              <w:jc w:val="center"/>
+            </w:pPr>
+            <w:r>
+              <w:rPr>
+                <w:b w:val="0"/>
+                <w:i/>
+                <w:color w:val="556670"/>
+                <w:sz w:val="14"/>
+              </w:rPr>
+              <w:t>What guests say — page, phone.</w:t>
+            </w:r>
+          </w:p>
+        </w:tc>
+        <w:tc>
+          <w:tcPr>
+            <w:tcW w:type="dxa" w:w="3153"/>
+            <w:tcMar>
+              <w:top w:w="60" w:type="dxa"/>
+              <w:start w:w="60" w:type="dxa"/>
+              <w:bottom w:w="60" w:type="dxa"/>
+              <w:end w:w="60" w:type="dxa"/>
+            </w:tcMar>
+          </w:tcPr>
+          <w:p>
+            <w:pPr>
+              <w:spacing w:after="20"/>
+              <w:jc w:val="center"/>
+            </w:pPr>
+            <w:r>
+              <w:drawing>
+                <wp:inline xmlns:a="http://schemas.openxmlformats.org/drawingml/2006/main" xmlns:pic="http://schemas.openxmlformats.org/drawingml/2006/picture">
+                  <wp:extent cx="1691640" cy="12969240"/>
+                  <wp:docPr id="23" name="Picture 23"/>
+                  <wp:cNvGraphicFramePr>
+                    <a:graphicFrameLocks noChangeAspect="1"/>
+                  </wp:cNvGraphicFramePr>
+                  <a:graphic>
+                    <a:graphicData uri="http://schemas.openxmlformats.org/drawingml/2006/picture">
+                      <pic:pic>
+                        <pic:nvPicPr>
+                          <pic:cNvPr id="0" name="phone-en-contact-98953.jpg"/>
+                          <pic:cNvPicPr/>
+                        </pic:nvPicPr>
+                        <pic:blipFill>
+                          <a:blip r:embed="rId35"/>
+                          <a:stretch>
+                            <a:fillRect/>
+                          </a:stretch>
+                        </pic:blipFill>
+                        <pic:spPr>
+                          <a:xfrm>
+                            <a:off x="0" y="0"/>
+                            <a:ext cx="1691640" cy="12969240"/>
+                          </a:xfrm>
+                          <a:prstGeom prst="rect"/>
+                        </pic:spPr>
+                      </pic:pic>
+                    </a:graphicData>
+                  </a:graphic>
+                </wp:inline>
+              </w:drawing>
+            </w:r>
+          </w:p>
+          <w:p>
+            <w:pPr>
+              <w:spacing w:after="0"/>
+              <w:jc w:val="center"/>
+            </w:pPr>
+            <w:r>
+              <w:rPr>
+                <w:b w:val="0"/>
+                <w:i/>
+                <w:color w:val="556670"/>
+                <w:sz w:val="14"/>
+              </w:rPr>
+              <w:t>Contact — English, phone.</w:t>
+            </w:r>
+          </w:p>
+        </w:tc>
+      </w:tr>
+    </w:tbl>
+    <w:p>
+      <w:pPr>
+        <w:spacing w:after="40"/>
+      </w:pPr>
+    </w:p>
+    <w:p>
+      <w:pPr>
+        <w:spacing w:before="240" w:after="100"/>
+      </w:pPr>
+      <w:r>
+        <w:rPr>
+          <w:b/>
+          <w:i w:val="0"/>
           <w:color w:val="0F2334"/>
           <w:sz w:val="23"/>
         </w:rPr>
         <w:t>Verification commands</w:t>
       </w:r>
     </w:p>
+    <w:tbl>
+      <w:tblPr>
+        <w:tblStyle w:val="TableGrid"/>
+        <w:tblW w:type="auto" w:w="0"/>
+        <w:jc w:val="center"/>
+        <w:tblLook w:firstColumn="1" w:firstRow="1" w:lastColumn="0" w:lastRow="0" w:noHBand="0" w:noVBand="1" w:val="04A0"/>
+      </w:tblPr>
+      <w:tblGrid>
+        <w:gridCol w:w="4729"/>
+        <w:gridCol w:w="4729"/>
+      </w:tblGrid>
+      <w:tr>
+        <w:tc>
+          <w:tcPr>
+            <w:tcW w:type="dxa" w:w="4729"/>
+            <w:shd w:val="clear" w:fill="0F2334"/>
+          </w:tcPr>
+          <w:p>
+            <w:r>
+              <w:rPr>
+                <w:rFonts w:ascii="Consolas" w:hAnsi="Consolas"/>
+                <w:b/>
+                <w:i w:val="0"/>
+                <w:color w:val="FFFFFF"/>
+                <w:sz w:val="17"/>
+              </w:rPr>
+              <w:t>npx tsc --noEmit</w:t>
+            </w:r>
+          </w:p>
+        </w:tc>
+        <w:tc>
+          <w:tcPr>
+            <w:tcW w:type="dxa" w:w="4729"/>
+            <w:shd w:val="clear" w:fill="F5F8FA"/>
+          </w:tcPr>
+          <w:p>
+            <w:r>
+              <w:rPr>
+                <w:b w:val="0"/>
+                <w:i/>
+                <w:color w:val="556670"/>
+                <w:sz w:val="17"/>
+              </w:rPr>
+              <w:t>exit 0</w:t>
+            </w:r>
+          </w:p>
+        </w:tc>
+      </w:tr>
+      <w:tr>
+        <w:tc>
+          <w:tcPr>
+            <w:tcW w:type="dxa" w:w="4729"/>
+            <w:shd w:val="clear" w:fill="0F2334"/>
+          </w:tcPr>
+          <w:p>
+            <w:r>
+              <w:rPr>
+                <w:rFonts w:ascii="Consolas" w:hAnsi="Consolas"/>
+                <w:b/>
+                <w:i w:val="0"/>
+                <w:color w:val="FFFFFF"/>
+                <w:sz w:val="17"/>
+              </w:rPr>
+              <w:t>npm run lint</w:t>
+            </w:r>
+          </w:p>
+        </w:tc>
+        <w:tc>
+          <w:tcPr>
+            <w:tcW w:type="dxa" w:w="4729"/>
+            <w:shd w:val="clear" w:fill="F5F8FA"/>
+          </w:tcPr>
+          <w:p>
+            <w:r>
+              <w:rPr>
+                <w:b w:val="0"/>
+                <w:i/>
+                <w:color w:val="556670"/>
+                <w:sz w:val="17"/>
+              </w:rPr>
+              <w:t>exit 0, 0 errors</w:t>
+            </w:r>
+          </w:p>
+        </w:tc>
+      </w:tr>
+      <w:tr>
+        <w:tc>
+          <w:tcPr>
+            <w:tcW w:type="dxa" w:w="4729"/>
+            <w:shd w:val="clear" w:fill="0F2334"/>
+          </w:tcPr>
+          <w:p>
+            <w:r>
+              <w:rPr>
+                <w:rFonts w:ascii="Consolas" w:hAnsi="Consolas"/>
+                <w:b/>
+                <w:i w:val="0"/>
+                <w:color w:val="FFFFFF"/>
+                <w:sz w:val="17"/>
+              </w:rPr>
+              <w:t>npm run build</w:t>
+            </w:r>
+          </w:p>
+        </w:tc>
+        <w:tc>
+          <w:tcPr>
+            <w:tcW w:type="dxa" w:w="4729"/>
+            <w:shd w:val="clear" w:fill="F5F8FA"/>
+          </w:tcPr>
+          <w:p>
+            <w:r>
+              <w:rPr>
+                <w:b w:val="0"/>
+                <w:i/>
+                <w:color w:val="556670"/>
+                <w:sz w:val="17"/>
+              </w:rPr>
+              <w:t>exit 0</w:t>
+            </w:r>
+          </w:p>
+        </w:tc>
+      </w:tr>
+      <w:tr>
+        <w:tc>
+          <w:tcPr>
+            <w:tcW w:type="dxa" w:w="4729"/>
+            <w:shd w:val="clear" w:fill="0F2334"/>
+          </w:tcPr>
+          <w:p>
+            <w:r>
+              <w:rPr>
+                <w:rFonts w:ascii="Consolas" w:hAnsi="Consolas"/>
+                <w:b/>
+                <w:i w:val="0"/>
+                <w:color w:val="FFFFFF"/>
+                <w:sz w:val="17"/>
+              </w:rPr>
+              <w:t>npm audit --audit-level=high</w:t>
+            </w:r>
+          </w:p>
+        </w:tc>
+        <w:tc>
+          <w:tcPr>
+            <w:tcW w:type="dxa" w:w="4729"/>
+            <w:shd w:val="clear" w:fill="F5F8FA"/>
+          </w:tcPr>
+          <w:p>
+            <w:r>
+              <w:rPr>
+                <w:b w:val="0"/>
+                <w:i/>
+                <w:color w:val="556670"/>
+                <w:sz w:val="17"/>
+              </w:rPr>
+              <w:t>0 vulnerabilities</w:t>
+            </w:r>
+          </w:p>
+        </w:tc>
+      </w:tr>
+    </w:tbl>
     <w:p>
       <w:pPr>
-        <w:spacing w:after="20"/>
-        <w:jc w:val="left"/>
+        <w:spacing w:after="40"/>
       </w:pPr>
-      <w:r>
-        <w:rPr>
-          <w:rFonts w:ascii="Consolas" w:hAnsi="Consolas"/>
-          <w:sz w:val="17"/>
-        </w:rPr>
-        <w:t>npx tsc --noEmit             # exit 0</w:t>
-      </w:r>
     </w:p>
-    <w:p>
-      <w:pPr>
-        <w:spacing w:after="20"/>
-        <w:jc w:val="left"/>
-      </w:pPr>
-      <w:r>
-        <w:rPr>
-          <w:rFonts w:ascii="Consolas" w:hAnsi="Consolas"/>
-          <w:sz w:val="17"/>
-        </w:rPr>
-        <w:t>npm run lint                 # exit 0, 0 errors</w:t>
-      </w:r>
-    </w:p>
-    <w:p>
-      <w:pPr>
-        <w:spacing w:after="20"/>
-        <w:jc w:val="left"/>
-      </w:pPr>
-      <w:r>
-        <w:rPr>
-          <w:rFonts w:ascii="Consolas" w:hAnsi="Consolas"/>
-          <w:sz w:val="17"/>
-        </w:rPr>
-        <w:t>npm run build                # exit 0</w:t>
-      </w:r>
-    </w:p>
-    <w:p>
-      <w:pPr>
-        <w:spacing w:after="20"/>
-        <w:jc w:val="left"/>
-      </w:pPr>
-      <w:r>
-        <w:rPr>
-          <w:rFonts w:ascii="Consolas" w:hAnsi="Consolas"/>
-          <w:sz w:val="17"/>
-        </w:rPr>
-        <w:t>npm audit --audit-level=high # 0 vulnerabilities</w:t>
-      </w:r>
-    </w:p>
-    <w:p>
-      <w:pPr>
-        <w:spacing w:after="120" w:line="288" w:lineRule="auto"/>
-      </w:pPr>
-      <w:r>
-        <w:rPr>
-          <w:i/>
-          <w:sz w:val="17"/>
-        </w:rPr>
-        <w:t>The browser measurements quoted above were produced by a throwaway Puppeteer harness, not committed to the repository: committing it would add an undeclared puppeteer-core dependency for a report artefact. It measured first paint, per-section geometry, heading structure, contrast per pixel, target sizes, link reachability, console and CSP errors across all locales and widths.</w:t>
-      </w:r>
-    </w:p>
+    <w:tbl>
+      <w:tblPr>
+        <w:tblW w:type="auto" w:w="0"/>
+        <w:jc w:val="center"/>
+        <w:tblLayout w:type="fixed"/>
+        <w:tblLook w:firstColumn="1" w:firstRow="1" w:lastColumn="0" w:lastRow="0" w:noHBand="0" w:noVBand="1" w:val="04A0"/>
+        <w:tblBorders>
+          <w:top w:val="none" w:sz="0" w:space="0"/>
+          <w:left w:val="none" w:sz="0" w:space="0"/>
+          <w:bottom w:val="none" w:sz="0" w:space="0"/>
+          <w:right w:val="none" w:sz="0" w:space="0"/>
+          <w:insideH w:val="none" w:sz="0" w:space="0"/>
+          <w:insideV w:val="none" w:sz="0" w:space="0"/>
+        </w:tblBorders>
+      </w:tblPr>
+      <w:tblGrid>
+        <w:gridCol w:w="9458"/>
+      </w:tblGrid>
+      <w:tr>
+        <w:tc>
+          <w:tcPr>
+            <w:tcW w:type="dxa" w:w="9936"/>
+            <w:shd w:val="clear" w:fill="ECF5F9"/>
+            <w:tcMar>
+              <w:top w:w="90" w:type="dxa"/>
+              <w:start w:w="130" w:type="dxa"/>
+              <w:bottom w:w="90" w:type="dxa"/>
+              <w:end w:w="130" w:type="dxa"/>
+            </w:tcMar>
+          </w:tcPr>
+          <w:p>
+            <w:pPr>
+              <w:spacing w:after="0"/>
+              <w:pBdr>
+                <w:left w:val="single" w:sz="18" w:space="6" w:color="2C7A9E"/>
+              </w:pBdr>
+            </w:pPr>
+            <w:r>
+              <w:rPr>
+                <w:b w:val="0"/>
+                <w:i/>
+                <w:color w:val="232B33"/>
+                <w:sz w:val="17"/>
+              </w:rPr>
+              <w:t>The browser measurements quoted above were produced by a throwaway Puppeteer harness, not committed to the repository: committing it would add an undeclared puppeteer-core dependency for a report artefact. It measured first paint, per-section geometry, heading structure, contrast per pixel, target sizes, link reachability, console and CSP errors across all locales and widths.</w:t>
+            </w:r>
+          </w:p>
+        </w:tc>
+      </w:tr>
+    </w:tbl>
     <w:sectPr>
-      <w:pgSz w:w="12240" w:h="15840"/>
-      <w:pgMar w:top="1008" w:right="1080" w:bottom="1008" w:left="1080" w:header="720" w:footer="720" w:gutter="0"/>
+      <w:headerReference w:type="first" r:id="rId9"/>
+      <w:footerReference w:type="first" r:id="rId10"/>
+      <w:headerReference w:type="default" r:id="rId12"/>
+      <w:footerReference w:type="default" r:id="rId13"/>
+      <w:pgSz w:w="11906" w:h="16838"/>
+      <w:pgMar w:top="864" w:right="1224" w:bottom="936" w:left="1224" w:header="576" w:footer="576" w:gutter="0"/>
       <w:cols w:space="720"/>
+      <w:titlePg/>
       <w:docGrid w:linePitch="360"/>
+      <w:pgNumType w:start="0"/>
     </w:sectPr>
   </w:body>
 </w:document>
+</file>
+
+<file path=word/footer1.xml><?xml version="1.0" encoding="utf-8"?>
+<w:ftr xmlns:m="http://schemas.openxmlformats.org/officeDocument/2006/math" xmlns:mc="http://schemas.openxmlformats.org/markup-compatibility/2006" xmlns:mo="http://schemas.microsoft.com/office/mac/office/2008/main" xmlns:mv="urn:schemas-microsoft-com:mac:vml" xmlns:o="urn:schemas-microsoft-com:office:office" xmlns:r="http://schemas.openxmlformats.org/officeDocument/2006/relationships" xmlns:v="urn:schemas-microsoft-com:vml" xmlns:w10="urn:schemas-microsoft-com:office:word" xmlns:w14="http://schemas.microsoft.com/office/word/2010/wordml" xmlns:w="http://schemas.openxmlformats.org/wordprocessingml/2006/main" xmlns:wne="http://schemas.microsoft.com/office/word/2006/wordml" xmlns:wp14="http://schemas.microsoft.com/office/word/2010/wordprocessingDrawing" xmlns:wp="http://schemas.openxmlformats.org/drawingml/2006/wordprocessingDrawing" xmlns:wpc="http://schemas.microsoft.com/office/word/2010/wordprocessingCanvas" xmlns:wpg="http://schemas.microsoft.com/office/word/2010/wordprocessingGroup" xmlns:wpi="http://schemas.microsoft.com/office/word/2010/wordprocessingInk" xmlns:wps="http://schemas.microsoft.com/office/word/2010/wordprocessingShape" mc:Ignorable="w14 wp14">
+  <w:p>
+    <w:pPr>
+      <w:pStyle w:val="Footer"/>
+    </w:pPr>
+    <w:r/>
+  </w:p>
+</w:ftr>
+</file>
+
+<file path=word/footer2.xml><?xml version="1.0" encoding="utf-8"?>
+<w:ftr xmlns:m="http://schemas.openxmlformats.org/officeDocument/2006/math" xmlns:mc="http://schemas.openxmlformats.org/markup-compatibility/2006" xmlns:mo="http://schemas.microsoft.com/office/mac/office/2008/main" xmlns:mv="urn:schemas-microsoft-com:mac:vml" xmlns:o="urn:schemas-microsoft-com:office:office" xmlns:r="http://schemas.openxmlformats.org/officeDocument/2006/relationships" xmlns:v="urn:schemas-microsoft-com:vml" xmlns:w10="urn:schemas-microsoft-com:office:word" xmlns:w14="http://schemas.microsoft.com/office/word/2010/wordml" xmlns:w="http://schemas.openxmlformats.org/wordprocessingml/2006/main" xmlns:wne="http://schemas.microsoft.com/office/word/2006/wordml" xmlns:wp14="http://schemas.microsoft.com/office/word/2010/wordprocessingDrawing" xmlns:wp="http://schemas.openxmlformats.org/drawingml/2006/wordprocessingDrawing" xmlns:wpc="http://schemas.microsoft.com/office/word/2010/wordprocessingCanvas" xmlns:wpg="http://schemas.microsoft.com/office/word/2010/wordprocessingGroup" xmlns:wpi="http://schemas.microsoft.com/office/word/2010/wordprocessingInk" xmlns:wps="http://schemas.microsoft.com/office/word/2010/wordprocessingShape" mc:Ignorable="w14 wp14">
+  <w:p>
+    <w:pPr>
+      <w:pStyle w:val="Footer"/>
+      <w:tabs>
+        <w:tab w:pos="9072" w:val="right"/>
+      </w:tabs>
+      <w:spacing w:before="40"/>
+    </w:pPr>
+    <w:r>
+      <w:rPr>
+        <w:b w:val="0"/>
+        <w:i w:val="0"/>
+        <w:color w:val="556670"/>
+        <w:sz w:val="16"/>
+      </w:rPr>
+      <w:t>Production audit &amp; verification</w:t>
+    </w:r>
+    <w:r>
+      <w:rPr>
+        <w:b w:val="0"/>
+        <w:i w:val="0"/>
+        <w:color w:val="556670"/>
+        <w:sz w:val="16"/>
+      </w:rPr>
+      <w:tab/>
+    </w:r>
+    <w:r>
+      <w:rPr>
+        <w:b w:val="0"/>
+        <w:i w:val="0"/>
+        <w:color w:val="556670"/>
+        <w:sz w:val="16"/>
+      </w:rPr>
+    </w:r>
+  </w:p>
+  <w:p>
+    <w:pPr>
+      <w:spacing w:after="0"/>
+      <w:jc w:val="center"/>
+      <w:pBdr>
+        <w:top w:val="single" w:sz="6" w:space="2" w:color="C9D6DE"/>
+      </w:pBdr>
+    </w:pPr>
+    <w:r>
+      <w:rPr>
+        <w:b w:val="0"/>
+        <w:i w:val="0"/>
+        <w:color w:val="556670"/>
+        <w:sz w:val="16"/>
+      </w:rPr>
+      <w:t xml:space="preserve">·  </w:t>
+    </w:r>
+    <w:r>
+      <w:rPr>
+        <w:sz w:val="16"/>
+      </w:rPr>
+      <w:fldChar w:fldCharType="begin"/>
+      <w:instrText xml:space="preserve"> PAGE </w:instrText>
+      <w:fldChar w:fldCharType="end"/>
+    </w:r>
+    <w:r>
+      <w:rPr>
+        <w:b w:val="0"/>
+        <w:i w:val="0"/>
+        <w:color w:val="556670"/>
+        <w:sz w:val="16"/>
+      </w:rPr>
+      <w:t xml:space="preserve">  ·</w:t>
+    </w:r>
+  </w:p>
+</w:ftr>
+</file>
+
+<file path=word/header1.xml><?xml version="1.0" encoding="utf-8"?>
+<w:hdr xmlns:m="http://schemas.openxmlformats.org/officeDocument/2006/math" xmlns:mc="http://schemas.openxmlformats.org/markup-compatibility/2006" xmlns:mo="http://schemas.microsoft.com/office/mac/office/2008/main" xmlns:mv="urn:schemas-microsoft-com:mac:vml" xmlns:o="urn:schemas-microsoft-com:office:office" xmlns:r="http://schemas.openxmlformats.org/officeDocument/2006/relationships" xmlns:v="urn:schemas-microsoft-com:vml" xmlns:w10="urn:schemas-microsoft-com:office:word" xmlns:w14="http://schemas.microsoft.com/office/word/2010/wordml" xmlns:w="http://schemas.openxmlformats.org/wordprocessingml/2006/main" xmlns:wne="http://schemas.microsoft.com/office/word/2006/wordml" xmlns:wp14="http://schemas.microsoft.com/office/word/2010/wordprocessingDrawing" xmlns:wp="http://schemas.openxmlformats.org/drawingml/2006/wordprocessingDrawing" xmlns:wpc="http://schemas.microsoft.com/office/word/2010/wordprocessingCanvas" xmlns:wpg="http://schemas.microsoft.com/office/word/2010/wordprocessingGroup" xmlns:wpi="http://schemas.microsoft.com/office/word/2010/wordprocessingInk" xmlns:wps="http://schemas.microsoft.com/office/word/2010/wordprocessingShape" mc:Ignorable="w14 wp14">
+  <w:p>
+    <w:pPr>
+      <w:pStyle w:val="Header"/>
+    </w:pPr>
+    <w:r/>
+  </w:p>
+</w:hdr>
+</file>
+
+<file path=word/header2.xml><?xml version="1.0" encoding="utf-8"?>
+<w:hdr xmlns:m="http://schemas.openxmlformats.org/officeDocument/2006/math" xmlns:mc="http://schemas.openxmlformats.org/markup-compatibility/2006" xmlns:mo="http://schemas.microsoft.com/office/mac/office/2008/main" xmlns:mv="urn:schemas-microsoft-com:mac:vml" xmlns:o="urn:schemas-microsoft-com:office:office" xmlns:r="http://schemas.openxmlformats.org/officeDocument/2006/relationships" xmlns:v="urn:schemas-microsoft-com:vml" xmlns:w10="urn:schemas-microsoft-com:office:word" xmlns:w14="http://schemas.microsoft.com/office/word/2010/wordml" xmlns:w="http://schemas.openxmlformats.org/wordprocessingml/2006/main" xmlns:wne="http://schemas.microsoft.com/office/word/2006/wordml" xmlns:wp14="http://schemas.microsoft.com/office/word/2010/wordprocessingDrawing" xmlns:wp="http://schemas.openxmlformats.org/drawingml/2006/wordprocessingDrawing" xmlns:wpc="http://schemas.microsoft.com/office/word/2010/wordprocessingCanvas" xmlns:wpg="http://schemas.microsoft.com/office/word/2010/wordprocessingGroup" xmlns:wpi="http://schemas.microsoft.com/office/word/2010/wordprocessingInk" xmlns:wps="http://schemas.microsoft.com/office/word/2010/wordprocessingShape" mc:Ignorable="w14 wp14">
+  <w:p>
+    <w:pPr>
+      <w:pStyle w:val="Header"/>
+      <w:jc w:val="left"/>
+      <w:pBdr>
+        <w:bottom w:val="single" w:sz="6" w:space="2" w:color="C9D6DE"/>
+      </w:pBdr>
+    </w:pPr>
+    <w:r>
+      <w:rPr>
+        <w:b w:val="0"/>
+        <w:i/>
+        <w:color w:val="556670"/>
+        <w:sz w:val="16"/>
+      </w:rPr>
+      <w:t>Production audit &amp; verification — 2026</w:t>
+    </w:r>
+  </w:p>
+</w:hdr>
 </file>
 
 <file path=word/numbering.xml><?xml version="1.0" encoding="utf-8"?>

</xml_diff>